<commit_message>
Trailer and GDD changes
</commit_message>
<xml_diff>
--- a/Documentation/GDD.docx
+++ b/Documentation/GDD.docx
@@ -1,6 +1,6 @@
 
 <file path=word/document.xml><?xml version="1.0" encoding="utf-8"?>
-<w:document xmlns:wpc="http://schemas.microsoft.com/office/word/2010/wordprocessingCanvas" xmlns:cx="http://schemas.microsoft.com/office/drawing/2014/chartex" xmlns:cx1="http://schemas.microsoft.com/office/drawing/2015/9/8/chartex" xmlns:cx2="http://schemas.microsoft.com/office/drawing/2015/10/21/chartex" xmlns:cx3="http://schemas.microsoft.com/office/drawing/2016/5/9/chartex" xmlns:cx4="http://schemas.microsoft.com/office/drawing/2016/5/10/chartex" xmlns:cx5="http://schemas.microsoft.com/office/drawing/2016/5/11/chartex" xmlns:cx6="http://schemas.microsoft.com/office/drawing/2016/5/12/chartex" xmlns:cx7="http://schemas.microsoft.com/office/drawing/2016/5/13/chartex" xmlns:cx8="http://schemas.microsoft.com/office/drawing/2016/5/14/chartex" xmlns:mc="http://schemas.openxmlformats.org/markup-compatibility/2006" xmlns:aink="http://schemas.microsoft.com/office/drawing/2016/ink" xmlns:am3d="http://schemas.microsoft.com/office/drawing/2017/model3d" xmlns:o="urn:schemas-microsoft-com:office:office" xmlns:r="http://schemas.openxmlformats.org/officeDocument/2006/relationships" xmlns:m="http://schemas.openxmlformats.org/officeDocument/2006/math" xmlns:v="urn:schemas-microsoft-com:vml" xmlns:wp14="http://schemas.microsoft.com/office/word/2010/wordprocessingDrawing" xmlns:wp="http://schemas.openxmlformats.org/drawingml/2006/wordprocessingDrawing" xmlns:w10="urn:schemas-microsoft-com:office:word" xmlns:w="http://schemas.openxmlformats.org/wordprocessingml/2006/main" xmlns:w14="http://schemas.microsoft.com/office/word/2010/wordml" xmlns:w15="http://schemas.microsoft.com/office/word/2012/wordml" xmlns:w16cid="http://schemas.microsoft.com/office/word/2016/wordml/cid" xmlns:w16se="http://schemas.microsoft.com/office/word/2015/wordml/symex" xmlns:wpg="http://schemas.microsoft.com/office/word/2010/wordprocessingGroup" xmlns:wpi="http://schemas.microsoft.com/office/word/2010/wordprocessingInk" xmlns:wne="http://schemas.microsoft.com/office/word/2006/wordml" xmlns:wps="http://schemas.microsoft.com/office/word/2010/wordprocessingShape" mc:Ignorable="w14 w15 w16se w16cid wp14">
+<w:document xmlns:wpc="http://schemas.microsoft.com/office/word/2010/wordprocessingCanvas" xmlns:cx="http://schemas.microsoft.com/office/drawing/2014/chartex" xmlns:cx1="http://schemas.microsoft.com/office/drawing/2015/9/8/chartex" xmlns:cx2="http://schemas.microsoft.com/office/drawing/2015/10/21/chartex" xmlns:cx3="http://schemas.microsoft.com/office/drawing/2016/5/9/chartex" xmlns:cx4="http://schemas.microsoft.com/office/drawing/2016/5/10/chartex" xmlns:cx5="http://schemas.microsoft.com/office/drawing/2016/5/11/chartex" xmlns:cx6="http://schemas.microsoft.com/office/drawing/2016/5/12/chartex" xmlns:cx7="http://schemas.microsoft.com/office/drawing/2016/5/13/chartex" xmlns:cx8="http://schemas.microsoft.com/office/drawing/2016/5/14/chartex" xmlns:mc="http://schemas.openxmlformats.org/markup-compatibility/2006" xmlns:aink="http://schemas.microsoft.com/office/drawing/2016/ink" xmlns:am3d="http://schemas.microsoft.com/office/drawing/2017/model3d" xmlns:o="urn:schemas-microsoft-com:office:office" xmlns:oel="http://schemas.microsoft.com/office/2019/extlst" xmlns:r="http://schemas.openxmlformats.org/officeDocument/2006/relationships" xmlns:m="http://schemas.openxmlformats.org/officeDocument/2006/math" xmlns:v="urn:schemas-microsoft-com:vml" xmlns:wp14="http://schemas.microsoft.com/office/word/2010/wordprocessingDrawing" xmlns:wp="http://schemas.openxmlformats.org/drawingml/2006/wordprocessingDrawing" xmlns:w10="urn:schemas-microsoft-com:office:word" xmlns:w="http://schemas.openxmlformats.org/wordprocessingml/2006/main" xmlns:w14="http://schemas.microsoft.com/office/word/2010/wordml" xmlns:w15="http://schemas.microsoft.com/office/word/2012/wordml" xmlns:w16cex="http://schemas.microsoft.com/office/word/2018/wordml/cex" xmlns:w16cid="http://schemas.microsoft.com/office/word/2016/wordml/cid" xmlns:w16="http://schemas.microsoft.com/office/word/2018/wordml" xmlns:w16du="http://schemas.microsoft.com/office/word/2023/wordml/word16du" xmlns:w16sdtdh="http://schemas.microsoft.com/office/word/2020/wordml/sdtdatahash" xmlns:w16sdtfl="http://schemas.microsoft.com/office/word/2024/wordml/sdtformatlock" xmlns:w16se="http://schemas.microsoft.com/office/word/2015/wordml/symex" xmlns:wpg="http://schemas.microsoft.com/office/word/2010/wordprocessingGroup" xmlns:wpi="http://schemas.microsoft.com/office/word/2010/wordprocessingInk" xmlns:wne="http://schemas.microsoft.com/office/word/2006/wordml" xmlns:wps="http://schemas.microsoft.com/office/word/2010/wordprocessingShape" mc:Ignorable="w14 w15 w16se w16cid w16 w16cex w16sdtdh w16sdtfl w16du wp14">
   <w:background w:color="FFFFFF"/>
   <w:body>
     <w:p/>
@@ -47,19 +47,26 @@
         </w:rPr>
         <w:t>Jonathan Andrews, Harrison Buck</w:t>
       </w:r>
-    </w:p>
-    <w:p>
-      <w:r>
-        <w:rPr>
-          <w:sz w:val="28"/>
-        </w:rPr>
-        <w:t>Email:</w:t>
-      </w:r>
       <w:r>
         <w:rPr>
           <w:color w:val="AB0000"/>
           <w:sz w:val="28"/>
         </w:rPr>
+        <w:t>, Morgan McGovern</w:t>
+      </w:r>
+    </w:p>
+    <w:p>
+      <w:r>
+        <w:rPr>
+          <w:sz w:val="28"/>
+        </w:rPr>
+        <w:t>Email:</w:t>
+      </w:r>
+      <w:r>
+        <w:rPr>
+          <w:color w:val="AB0000"/>
+          <w:sz w:val="28"/>
+        </w:rPr>
         <w:t xml:space="preserve"> </w:t>
       </w:r>
       <w:r>
@@ -78,13 +85,15 @@
         </w:rPr>
         <w:t xml:space="preserve">URL for project GIT repo: </w:t>
       </w:r>
-      <w:r>
-        <w:rPr>
-          <w:color w:val="AB0000"/>
-          <w:sz w:val="24"/>
-        </w:rPr>
-        <w:t>&lt;insert active link to repo using insert menu&gt;</w:t>
-      </w:r>
+      <w:hyperlink r:id="rId7" w:history="1">
+        <w:r>
+          <w:rPr>
+            <w:rStyle w:val="Hyperlink"/>
+            <w:sz w:val="24"/>
+          </w:rPr>
+          <w:t>https://github.com/JAndrews004/COMP3013</w:t>
+        </w:r>
+      </w:hyperlink>
     </w:p>
     <w:p>
       <w:pPr>
@@ -769,7 +778,37 @@
         <w:rPr>
           <w:sz w:val="24"/>
         </w:rPr>
-        <w:t xml:space="preserve">This document is to specify the details about [Enter name] to allow uninitiated members to understand the design and development of the product. </w:t>
+        <w:t xml:space="preserve">This document is to specify the details about </w:t>
+      </w:r>
+      <w:r>
+        <w:rPr>
+          <w:sz w:val="24"/>
+        </w:rPr>
+        <w:t xml:space="preserve">Last Orders </w:t>
+      </w:r>
+      <w:r>
+        <w:rPr>
+          <w:sz w:val="24"/>
+        </w:rPr>
+        <w:t xml:space="preserve">to allow uninitiated members to understand the design and development of the product. </w:t>
+      </w:r>
+      <w:r>
+        <w:rPr>
+          <w:sz w:val="24"/>
+        </w:rPr>
+        <w:t xml:space="preserve">This games genre is primarily a simulation game that is fast-paced and intense. This product is unique because of the combination of these elements. </w:t>
+      </w:r>
+      <w:r>
+        <w:rPr>
+          <w:sz w:val="24"/>
+        </w:rPr>
+        <w:t>Last Orders</w:t>
+      </w:r>
+      <w:r>
+        <w:rPr>
+          <w:sz w:val="24"/>
+        </w:rPr>
+        <w:t xml:space="preserve"> is a prototype to allow for third parties to show interest in continued development.</w:t>
       </w:r>
     </w:p>
     <w:p>
@@ -805,19 +844,13 @@
         <w:rPr>
           <w:sz w:val="24"/>
         </w:rPr>
-        <w:t>This document</w:t>
-      </w:r>
-      <w:r>
-        <w:rPr>
-          <w:sz w:val="24"/>
-        </w:rPr>
-        <w:t>’</w:t>
-      </w:r>
-      <w:r>
-        <w:rPr>
-          <w:sz w:val="24"/>
-        </w:rPr>
-        <w:t>s is intended to be used by games programmers, designers and anyone with interest in this products development.</w:t>
+        <w:t>This document is intended to be used by games programmers, designers and anyone with interest in this products development.</w:t>
+      </w:r>
+      <w:r>
+        <w:rPr>
+          <w:sz w:val="24"/>
+        </w:rPr>
+        <w:t xml:space="preserve"> This document will include design decisions and decisions to do with the planning and development of the game. This document will not include specific code or any technical information relating to the game’s architecture and systems.</w:t>
       </w:r>
     </w:p>
     <w:p>
@@ -855,6 +888,12 @@
         </w:rPr>
         <w:t>The target platform for this game is Windows pc systems.</w:t>
       </w:r>
+      <w:r>
+        <w:rPr>
+          <w:sz w:val="24"/>
+        </w:rPr>
+        <w:t xml:space="preserve"> This is due to the mouse precision it offers and ease of development. Mobile is not supported due to additional design considerations but may be possible in the future. Consoles are also not supported due to the lack of access to testing apparatus and capital for licences. </w:t>
+      </w:r>
     </w:p>
     <w:p>
       <w:r>
@@ -897,16 +936,46 @@
         <w:rPr>
           <w:sz w:val="24"/>
         </w:rPr>
-        <w:t>For the development of this product Unity version 2023.3.38f1 will be used for the main reason that the developers involved have the most experience with it.</w:t>
-      </w:r>
-    </w:p>
-    <w:p>
+        <w:t>For the development of this product Unity version 2023.3.38f1 will be used for the main reason that</w:t>
+      </w:r>
       <w:r>
         <w:rPr>
           <w:sz w:val="24"/>
         </w:rPr>
         <w:t xml:space="preserve"> </w:t>
       </w:r>
+      <w:r>
+        <w:rPr>
+          <w:sz w:val="24"/>
+        </w:rPr>
+        <w:t>Last Orders</w:t>
+      </w:r>
+      <w:r>
+        <w:rPr>
+          <w:sz w:val="24"/>
+        </w:rPr>
+        <w:t xml:space="preserve"> is very UI heavy and Unity offers easy development for this</w:t>
+      </w:r>
+      <w:r>
+        <w:rPr>
+          <w:sz w:val="24"/>
+        </w:rPr>
+        <w:t>.</w:t>
+      </w:r>
+      <w:r>
+        <w:rPr>
+          <w:sz w:val="24"/>
+        </w:rPr>
+        <w:t xml:space="preserve"> The team is also quite experienced in Unity so this will speed up development.</w:t>
+      </w:r>
+    </w:p>
+    <w:p>
+      <w:r>
+        <w:rPr>
+          <w:sz w:val="24"/>
+        </w:rPr>
+        <w:t xml:space="preserve"> </w:t>
+      </w:r>
     </w:p>
     <w:p>
       <w:pPr>
@@ -935,6 +1004,12 @@
         </w:rPr>
         <w:t>The software used for programming is visual studio 2022</w:t>
       </w:r>
+      <w:r>
+        <w:rPr>
+          <w:sz w:val="24"/>
+        </w:rPr>
+        <w:t xml:space="preserve"> and will be using C# for the Unity integration and OOP support.</w:t>
+      </w:r>
     </w:p>
     <w:p>
       <w:r>
@@ -969,7 +1044,37 @@
         <w:rPr>
           <w:sz w:val="24"/>
         </w:rPr>
-        <w:t xml:space="preserve">Any 3d models produced will be in blender 4.3 and textures will be developed in [software name here]. Most assets will be acquired through the </w:t>
+        <w:t xml:space="preserve">Any 3d models produced will be in blender 4.3 and textures will be developed in </w:t>
+      </w:r>
+      <w:r>
+        <w:rPr>
+          <w:sz w:val="24"/>
+        </w:rPr>
+        <w:t>Last Orders</w:t>
+      </w:r>
+      <w:r>
+        <w:rPr>
+          <w:sz w:val="24"/>
+        </w:rPr>
+        <w:t>.</w:t>
+      </w:r>
+      <w:r>
+        <w:rPr>
+          <w:sz w:val="24"/>
+        </w:rPr>
+        <w:t xml:space="preserve"> </w:t>
+      </w:r>
+      <w:r>
+        <w:rPr>
+          <w:sz w:val="24"/>
+        </w:rPr>
+        <w:t>Almost all</w:t>
+      </w:r>
+      <w:r>
+        <w:rPr>
+          <w:sz w:val="24"/>
+        </w:rPr>
+        <w:t xml:space="preserve"> assets will be acquired through the </w:t>
       </w:r>
       <w:r>
         <w:rPr>
@@ -983,6 +1088,12 @@
         </w:rPr>
         <w:t xml:space="preserve"> as to avoid legal issues.</w:t>
       </w:r>
+      <w:r>
+        <w:rPr>
+          <w:sz w:val="24"/>
+        </w:rPr>
+        <w:t xml:space="preserve"> This is due to the limited timeline for the development of this project. Some more simple geometry models will be produced by us. To ensure consistency in style we will be using low poly models with simple textures. </w:t>
+      </w:r>
     </w:p>
     <w:p>
       <w:r>
@@ -1027,6 +1138,25 @@
         </w:rPr>
         <w:t>The concept of this game is that the player is working at a bar serving drinks to various customers. The aim of the game is to make enough drinks correctly for customers to then earn enough ‘money’ to pay the rent due at the end of each day. The ‘money’ received will be based on drink accuracy and speed of delivery.</w:t>
       </w:r>
+      <w:r>
+        <w:rPr>
+          <w:sz w:val="24"/>
+        </w:rPr>
+        <w:t xml:space="preserve"> The core gameplay loop: Order ticket arrives -&gt; make drink -</w:t>
+      </w:r>
+      <w:r>
+        <w:rPr>
+          <w:sz w:val="24"/>
+        </w:rPr>
+        <w:lastRenderedPageBreak/>
+        <w:t>&gt; serve -&gt; get reputation and money -&gt; repeat until night ends -&gt; upgrade and repeat</w:t>
+      </w:r>
+      <w:r>
+        <w:rPr>
+          <w:sz w:val="24"/>
+        </w:rPr>
+        <w:t>. The player will be pressured by the time the order is available if they do not complete it beforehand, they receive a reputation and monetary penalty. The difficulty will increase through new recipes being added through the game to a maximum of 5 for the demo.</w:t>
+      </w:r>
     </w:p>
     <w:p>
       <w:r>
@@ -1099,6 +1229,12 @@
         </w:rPr>
         <w:t>A rundown bar the player owns primarily working at night.</w:t>
       </w:r>
+      <w:r>
+        <w:rPr>
+          <w:sz w:val="24"/>
+        </w:rPr>
+        <w:t xml:space="preserve"> The bar will be a medieval style that is well lit. The player will go through multiple nights, but the setting will remain the same.</w:t>
+      </w:r>
     </w:p>
     <w:p>
       <w:r>
@@ -1127,7 +1263,51 @@
         <w:rPr>
           <w:sz w:val="24"/>
         </w:rPr>
-        <w:t>The player works each night to earn enough money to survive. If more money is earned it can be invested into upgrades for the bar which could earn more money or get more customers.</w:t>
+        <w:t>The player works each night to earn enough money to survive</w:t>
+      </w:r>
+      <w:r>
+        <w:rPr>
+          <w:sz w:val="24"/>
+        </w:rPr>
+        <w:t xml:space="preserve"> during the night</w:t>
+      </w:r>
+      <w:r>
+        <w:rPr>
+          <w:sz w:val="24"/>
+        </w:rPr>
+        <w:t>. If more money is earned it can be invested into upgrades for the bar which could earn more money or get more customers</w:t>
+      </w:r>
+      <w:r>
+        <w:rPr>
+          <w:sz w:val="24"/>
+        </w:rPr>
+        <w:t xml:space="preserve"> during the day</w:t>
+      </w:r>
+      <w:r>
+        <w:rPr>
+          <w:sz w:val="24"/>
+        </w:rPr>
+        <w:t>.</w:t>
+      </w:r>
+      <w:r>
+        <w:rPr>
+          <w:sz w:val="24"/>
+        </w:rPr>
+        <w:t xml:space="preserve"> A player can fail a night by resetting the drink being made too many times and can fail the day if there isn’t enough money to pay rent with. The upgrades will affect the money earned, the lifetime of order tickets and reduction in rent. This will allow players to customise a run better. Currently only an endless mode is available to show off the core mechanics. If the player fails to pay </w:t>
+      </w:r>
+      <w:proofErr w:type="gramStart"/>
+      <w:r>
+        <w:rPr>
+          <w:sz w:val="24"/>
+        </w:rPr>
+        <w:t>rent</w:t>
+      </w:r>
+      <w:proofErr w:type="gramEnd"/>
+      <w:r>
+        <w:rPr>
+          <w:sz w:val="24"/>
+        </w:rPr>
+        <w:t xml:space="preserve"> they return to the main menu where they can restart.</w:t>
       </w:r>
     </w:p>
     <w:p>
@@ -1143,7 +1323,6 @@
         <w:rPr>
           <w:sz w:val="24"/>
         </w:rPr>
-        <w:lastRenderedPageBreak/>
         <w:t>5.5 Players</w:t>
       </w:r>
     </w:p>
@@ -1209,6 +1388,12 @@
         </w:rPr>
         <w:t>. Then move completed drinks to the correct space to complete the order.</w:t>
       </w:r>
+      <w:r>
+        <w:rPr>
+          <w:sz w:val="24"/>
+        </w:rPr>
+        <w:t xml:space="preserve"> To select ingredients the player clicks them to select then clicks on the drink to add. The garnishes such as ice and lemon slices can also be dragged but is an optional addition. For the shaking a mini game is started where the player must click and hold a shaker and move the mouse until the progress bar is full. A similar mini game for stirring occurs but the player must move the mouse in a circle.</w:t>
+      </w:r>
     </w:p>
     <w:p>
       <w:r>
@@ -1245,6 +1430,12 @@
         </w:rPr>
         <w:t xml:space="preserve"> and satisfy your customers drinking needs.</w:t>
       </w:r>
+      <w:r>
+        <w:rPr>
+          <w:sz w:val="24"/>
+        </w:rPr>
+        <w:t xml:space="preserve"> Short-term goals: complete orders and earn money to pay rent. Long-term goals: Upgrade the bar to make gameplay a bit easier and survive as many nights as possible.</w:t>
+      </w:r>
     </w:p>
     <w:p>
       <w:r>
@@ -1294,7 +1485,19 @@
         <w:rPr>
           <w:sz w:val="24"/>
         </w:rPr>
-        <w:t>Low-poly medieval style.</w:t>
+        <w:t>Low-poly medieval style</w:t>
+      </w:r>
+      <w:r>
+        <w:rPr>
+          <w:sz w:val="24"/>
+        </w:rPr>
+        <w:t xml:space="preserve"> for aesthetics and clarity</w:t>
+      </w:r>
+      <w:r>
+        <w:rPr>
+          <w:sz w:val="24"/>
+        </w:rPr>
+        <w:t>.</w:t>
       </w:r>
     </w:p>
     <w:p>
@@ -1338,6 +1541,7 @@
         <w:rPr>
           <w:sz w:val="24"/>
         </w:rPr>
+        <w:lastRenderedPageBreak/>
         <w:t xml:space="preserve"> </w:t>
       </w:r>
     </w:p>
@@ -1378,21 +1582,31 @@
         <w:rPr>
           <w:sz w:val="24"/>
         </w:rPr>
-        <w:t xml:space="preserve"> orangey-</w:t>
-      </w:r>
-      <w:proofErr w:type="gramStart"/>
-      <w:r>
-        <w:rPr>
-          <w:sz w:val="24"/>
-        </w:rPr>
-        <w:t>brown ,</w:t>
-      </w:r>
-      <w:proofErr w:type="gramEnd"/>
-      <w:r>
-        <w:rPr>
-          <w:sz w:val="24"/>
-        </w:rPr>
-        <w:t xml:space="preserve"> #</w:t>
+        <w:t xml:space="preserve"> </w:t>
+      </w:r>
+      <w:r>
+        <w:rPr>
+          <w:sz w:val="24"/>
+        </w:rPr>
+        <w:t>orangey brown</w:t>
+      </w:r>
+      <w:r>
+        <w:rPr>
+          <w:sz w:val="24"/>
+        </w:rPr>
+        <w:t xml:space="preserve"> </w:t>
+      </w:r>
+      <w:r>
+        <w:rPr>
+          <w:sz w:val="24"/>
+        </w:rPr>
+        <w:t>for the environment with some variation for accents, highlights etc</w:t>
+      </w:r>
+      <w:r>
+        <w:rPr>
+          <w:sz w:val="24"/>
+        </w:rPr>
+        <w:t>, #</w:t>
       </w:r>
       <w:r>
         <w:rPr>
@@ -1406,6 +1620,18 @@
         </w:rPr>
         <w:t xml:space="preserve"> steel colour</w:t>
       </w:r>
+      <w:r>
+        <w:rPr>
+          <w:sz w:val="24"/>
+        </w:rPr>
+        <w:t xml:space="preserve"> for the </w:t>
+      </w:r>
+      <w:r>
+        <w:rPr>
+          <w:sz w:val="24"/>
+        </w:rPr>
+        <w:t>metal on parts of cups or the shaker for example.</w:t>
+      </w:r>
     </w:p>
     <w:p>
       <w:r>
@@ -1460,6 +1686,12 @@
       </w:r>
     </w:p>
     <w:p>
+      <w:pPr>
+        <w:rPr>
+          <w:color w:val="000000" w:themeColor="text1"/>
+          <w:sz w:val="24"/>
+        </w:rPr>
+      </w:pPr>
       <w:r>
         <w:rPr>
           <w:sz w:val="24"/>
@@ -1476,14 +1708,97 @@
         <w:rPr>
           <w:color w:val="000000" w:themeColor="text1"/>
           <w:sz w:val="24"/>
-          <w:highlight w:val="yellow"/>
-        </w:rPr>
-        <w:t>Provide visual overview and represent core mechanic in Include initial concept art, characters, environment, UI, level design, menus, scoring…</w:t>
-      </w:r>
-      <w:bookmarkStart w:id="0" w:name="_GoBack"/>
-      <w:bookmarkEnd w:id="0"/>
-    </w:p>
-    <w:p>
+        </w:rPr>
+        <w:t>The UI will consist of a reputation bar at the top of the screen with a current order steps queue to the left of the screen to allow players to see what they have added. A large submit button at the top of the screen and the order tickets at the bottom of the screen.</w:t>
+      </w:r>
+    </w:p>
+    <w:p>
+      <w:pPr>
+        <w:rPr>
+          <w:color w:val="000000" w:themeColor="text1"/>
+          <w:sz w:val="24"/>
+        </w:rPr>
+      </w:pPr>
+    </w:p>
+    <w:p>
+      <w:pPr>
+        <w:rPr>
+          <w:color w:val="000000" w:themeColor="text1"/>
+          <w:sz w:val="24"/>
+        </w:rPr>
+      </w:pPr>
+      <w:r>
+        <w:rPr>
+          <w:noProof/>
+          <w:color w:val="000000" w:themeColor="text1"/>
+          <w:sz w:val="24"/>
+        </w:rPr>
+        <w:drawing>
+          <wp:inline distT="0" distB="0" distL="0" distR="0" wp14:anchorId="3F0FD415" wp14:editId="2048DF02">
+            <wp:extent cx="6645910" cy="3728720"/>
+            <wp:effectExtent l="0" t="0" r="2540" b="5080"/>
+            <wp:docPr id="970521584" name="Picture 1"/>
+            <wp:cNvGraphicFramePr>
+              <a:graphicFrameLocks xmlns:a="http://schemas.openxmlformats.org/drawingml/2006/main" noChangeAspect="1"/>
+            </wp:cNvGraphicFramePr>
+            <a:graphic xmlns:a="http://schemas.openxmlformats.org/drawingml/2006/main">
+              <a:graphicData uri="http://schemas.openxmlformats.org/drawingml/2006/picture">
+                <pic:pic xmlns:pic="http://schemas.openxmlformats.org/drawingml/2006/picture">
+                  <pic:nvPicPr>
+                    <pic:cNvPr id="970521584" name="Picture 970521584"/>
+                    <pic:cNvPicPr/>
+                  </pic:nvPicPr>
+                  <pic:blipFill>
+                    <a:blip r:embed="rId8" cstate="print">
+                      <a:extLst>
+                        <a:ext uri="{28A0092B-C50C-407E-A947-70E740481C1C}">
+                          <a14:useLocalDpi xmlns:a14="http://schemas.microsoft.com/office/drawing/2010/main" val="0"/>
+                        </a:ext>
+                      </a:extLst>
+                    </a:blip>
+                    <a:stretch>
+                      <a:fillRect/>
+                    </a:stretch>
+                  </pic:blipFill>
+                  <pic:spPr>
+                    <a:xfrm>
+                      <a:off x="0" y="0"/>
+                      <a:ext cx="6645910" cy="3728720"/>
+                    </a:xfrm>
+                    <a:prstGeom prst="rect">
+                      <a:avLst/>
+                    </a:prstGeom>
+                  </pic:spPr>
+                </pic:pic>
+              </a:graphicData>
+            </a:graphic>
+          </wp:inline>
+        </w:drawing>
+      </w:r>
+    </w:p>
+    <w:p>
+      <w:pPr>
+        <w:rPr>
+          <w:color w:val="000000" w:themeColor="text1"/>
+          <w:sz w:val="24"/>
+        </w:rPr>
+      </w:pPr>
+    </w:p>
+    <w:p>
+      <w:r>
+        <w:rPr>
+          <w:color w:val="000000" w:themeColor="text1"/>
+          <w:sz w:val="24"/>
+        </w:rPr>
+        <w:t xml:space="preserve"> For feedback systems there are some visual indicators such as selected ingredients having a slight animation and an audio queue. The order tickets have a remove sound to let the player know one was removed. </w:t>
+      </w:r>
+    </w:p>
+    <w:p>
+      <w:pPr>
+        <w:rPr>
+          <w:sz w:val="24"/>
+        </w:rPr>
+      </w:pPr>
       <w:r>
         <w:rPr>
           <w:sz w:val="24"/>
@@ -1493,6 +1808,135 @@
     </w:p>
     <w:p>
       <w:pPr>
+        <w:rPr>
+          <w:sz w:val="24"/>
+        </w:rPr>
+      </w:pPr>
+      <w:r>
+        <w:rPr>
+          <w:sz w:val="24"/>
+        </w:rPr>
+        <w:t>There is also a recipe book that shows the steps required to complete a drink.</w:t>
+      </w:r>
+    </w:p>
+    <w:p>
+      <w:pPr>
+        <w:rPr>
+          <w:sz w:val="24"/>
+        </w:rPr>
+      </w:pPr>
+      <w:r>
+        <w:rPr>
+          <w:noProof/>
+          <w:sz w:val="24"/>
+        </w:rPr>
+        <w:lastRenderedPageBreak/>
+        <w:drawing>
+          <wp:inline distT="0" distB="0" distL="0" distR="0" wp14:anchorId="2016705D" wp14:editId="61233F86">
+            <wp:extent cx="6645910" cy="3667760"/>
+            <wp:effectExtent l="0" t="0" r="2540" b="8890"/>
+            <wp:docPr id="1957949548" name="Picture 2"/>
+            <wp:cNvGraphicFramePr>
+              <a:graphicFrameLocks xmlns:a="http://schemas.openxmlformats.org/drawingml/2006/main" noChangeAspect="1"/>
+            </wp:cNvGraphicFramePr>
+            <a:graphic xmlns:a="http://schemas.openxmlformats.org/drawingml/2006/main">
+              <a:graphicData uri="http://schemas.openxmlformats.org/drawingml/2006/picture">
+                <pic:pic xmlns:pic="http://schemas.openxmlformats.org/drawingml/2006/picture">
+                  <pic:nvPicPr>
+                    <pic:cNvPr id="1957949548" name="Picture 1957949548"/>
+                    <pic:cNvPicPr/>
+                  </pic:nvPicPr>
+                  <pic:blipFill>
+                    <a:blip r:embed="rId9" cstate="print">
+                      <a:extLst>
+                        <a:ext uri="{28A0092B-C50C-407E-A947-70E740481C1C}">
+                          <a14:useLocalDpi xmlns:a14="http://schemas.microsoft.com/office/drawing/2010/main" val="0"/>
+                        </a:ext>
+                      </a:extLst>
+                    </a:blip>
+                    <a:stretch>
+                      <a:fillRect/>
+                    </a:stretch>
+                  </pic:blipFill>
+                  <pic:spPr>
+                    <a:xfrm>
+                      <a:off x="0" y="0"/>
+                      <a:ext cx="6645910" cy="3667760"/>
+                    </a:xfrm>
+                    <a:prstGeom prst="rect">
+                      <a:avLst/>
+                    </a:prstGeom>
+                  </pic:spPr>
+                </pic:pic>
+              </a:graphicData>
+            </a:graphic>
+          </wp:inline>
+        </w:drawing>
+      </w:r>
+    </w:p>
+    <w:p>
+      <w:pPr>
+        <w:rPr>
+          <w:sz w:val="24"/>
+        </w:rPr>
+      </w:pPr>
+      <w:r>
+        <w:rPr>
+          <w:sz w:val="24"/>
+        </w:rPr>
+        <w:t>There is also the hub menu with a night overview in the centre with the upgrade list on the right to be purchased.</w:t>
+      </w:r>
+    </w:p>
+    <w:p>
+      <w:r>
+        <w:rPr>
+          <w:noProof/>
+        </w:rPr>
+        <w:drawing>
+          <wp:inline distT="0" distB="0" distL="0" distR="0" wp14:anchorId="5DAFFCEC" wp14:editId="710B7F65">
+            <wp:extent cx="6645910" cy="3734435"/>
+            <wp:effectExtent l="0" t="0" r="2540" b="0"/>
+            <wp:docPr id="1629223020" name="Picture 3"/>
+            <wp:cNvGraphicFramePr>
+              <a:graphicFrameLocks xmlns:a="http://schemas.openxmlformats.org/drawingml/2006/main" noChangeAspect="1"/>
+            </wp:cNvGraphicFramePr>
+            <a:graphic xmlns:a="http://schemas.openxmlformats.org/drawingml/2006/main">
+              <a:graphicData uri="http://schemas.openxmlformats.org/drawingml/2006/picture">
+                <pic:pic xmlns:pic="http://schemas.openxmlformats.org/drawingml/2006/picture">
+                  <pic:nvPicPr>
+                    <pic:cNvPr id="1629223020" name="Picture 1629223020"/>
+                    <pic:cNvPicPr/>
+                  </pic:nvPicPr>
+                  <pic:blipFill>
+                    <a:blip r:embed="rId10" cstate="print">
+                      <a:extLst>
+                        <a:ext uri="{28A0092B-C50C-407E-A947-70E740481C1C}">
+                          <a14:useLocalDpi xmlns:a14="http://schemas.microsoft.com/office/drawing/2010/main" val="0"/>
+                        </a:ext>
+                      </a:extLst>
+                    </a:blip>
+                    <a:stretch>
+                      <a:fillRect/>
+                    </a:stretch>
+                  </pic:blipFill>
+                  <pic:spPr>
+                    <a:xfrm>
+                      <a:off x="0" y="0"/>
+                      <a:ext cx="6645910" cy="3734435"/>
+                    </a:xfrm>
+                    <a:prstGeom prst="rect">
+                      <a:avLst/>
+                    </a:prstGeom>
+                  </pic:spPr>
+                </pic:pic>
+              </a:graphicData>
+            </a:graphic>
+          </wp:inline>
+        </w:drawing>
+      </w:r>
+    </w:p>
+    <w:p>
+      <w:pPr>
         <w:pStyle w:val="Heading2"/>
       </w:pPr>
       <w:r>
@@ -1531,7 +1975,25 @@
         <w:rPr>
           <w:sz w:val="24"/>
         </w:rPr>
-        <w:t>None for demo, Game progress in the future</w:t>
+        <w:t>Player preferences</w:t>
+      </w:r>
+      <w:r>
+        <w:rPr>
+          <w:sz w:val="24"/>
+        </w:rPr>
+        <w:t xml:space="preserve"> for demo</w:t>
+      </w:r>
+      <w:r>
+        <w:rPr>
+          <w:sz w:val="24"/>
+        </w:rPr>
+        <w:t xml:space="preserve"> (game volume settings)</w:t>
+      </w:r>
+      <w:r>
+        <w:rPr>
+          <w:sz w:val="24"/>
+        </w:rPr>
+        <w:t>, Game progress in the future</w:t>
       </w:r>
     </w:p>
     <w:p>
@@ -1555,6 +2017,7 @@
         <w:rPr>
           <w:sz w:val="24"/>
         </w:rPr>
+        <w:lastRenderedPageBreak/>
         <w:t xml:space="preserve">        </w:t>
       </w:r>
       <w:r>
@@ -1639,7 +2102,7 @@
         <w:rPr>
           <w:sz w:val="24"/>
         </w:rPr>
-        <w:t>None.</w:t>
+        <w:t>Money and reputation during runtime. None saved permanently.</w:t>
       </w:r>
     </w:p>
     <w:p>
@@ -1664,456 +2127,1315 @@
       </w:r>
     </w:p>
     <w:p>
-      <w:r>
+      <w:pPr>
+        <w:rPr>
+          <w:b/>
+          <w:bCs/>
+          <w:sz w:val="24"/>
+        </w:rPr>
+      </w:pPr>
+      <w:r>
+        <w:tab/>
+      </w:r>
+      <w:r>
+        <w:rPr>
+          <w:sz w:val="24"/>
+        </w:rPr>
+        <w:t>Target audience is 16+ due to the alcohol content included</w:t>
+      </w:r>
+      <w:r>
+        <w:rPr>
+          <w:sz w:val="24"/>
+        </w:rPr>
+        <w:t xml:space="preserve"> as </w:t>
+      </w:r>
+      <w:r>
+        <w:rPr>
+          <w:sz w:val="24"/>
+        </w:rPr>
+        <w:t>PEGI 16</w:t>
+      </w:r>
+      <w:r>
+        <w:rPr>
+          <w:sz w:val="24"/>
+        </w:rPr>
+        <w:t xml:space="preserve"> guidelines suggest this</w:t>
+      </w:r>
+      <w:r>
+        <w:rPr>
+          <w:sz w:val="24"/>
+        </w:rPr>
+        <w:t>. No personal data collected. Only correct Copyright assets will be used (Creative Commons) with credits given. Disclaimer of alcohol content at start of the game.</w:t>
+      </w:r>
+    </w:p>
+    <w:p/>
+    <w:p>
+      <w:pPr>
+        <w:pStyle w:val="Heading2"/>
+      </w:pPr>
+      <w:r>
+        <w:t>8. Gameplay</w:t>
+      </w:r>
+    </w:p>
+    <w:p>
+      <w:pPr>
+        <w:rPr>
+          <w:sz w:val="24"/>
+        </w:rPr>
+      </w:pPr>
+    </w:p>
+    <w:p>
+      <w:r>
+        <w:rPr>
+          <w:sz w:val="24"/>
+        </w:rPr>
+        <w:t>8.1 World</w:t>
+      </w:r>
+    </w:p>
+    <w:p>
+      <w:pPr>
+        <w:ind w:firstLine="720"/>
+      </w:pPr>
+      <w:r>
+        <w:rPr>
+          <w:sz w:val="24"/>
+        </w:rPr>
+        <w:t>A late medieval tavern scene of mainly the bar area which is where the ingredients will be stored. Some background scene will be included to show NPC’s ordering and their feedback and price they pay.</w:t>
+      </w:r>
+    </w:p>
+    <w:p>
+      <w:r>
+        <w:rPr>
+          <w:sz w:val="24"/>
+        </w:rPr>
+        <w:t xml:space="preserve"> </w:t>
+      </w:r>
+    </w:p>
+    <w:p>
+      <w:r>
+        <w:rPr>
+          <w:sz w:val="24"/>
+        </w:rPr>
+        <w:t>8.2 Object types</w:t>
+      </w:r>
+    </w:p>
+    <w:p>
+      <w:r>
+        <w:rPr>
+          <w:sz w:val="24"/>
+        </w:rPr>
+        <w:t xml:space="preserve">        </w:t>
+      </w:r>
+      <w:r>
+        <w:rPr>
+          <w:sz w:val="24"/>
+        </w:rPr>
+        <w:tab/>
+      </w:r>
+      <w:r>
+        <w:rPr>
+          <w:sz w:val="24"/>
+        </w:rPr>
+        <w:t>The player will be able to interact with the ingredients such as the alcohol, mixers, ice, garnishes, the glass the drink will be served in, the mixing instruments and the order tickets and serving area.</w:t>
+      </w:r>
+    </w:p>
+    <w:p>
+      <w:r>
+        <w:rPr>
+          <w:sz w:val="24"/>
+        </w:rPr>
+        <w:t xml:space="preserve"> </w:t>
+      </w:r>
+    </w:p>
+    <w:p>
+      <w:r>
+        <w:rPr>
+          <w:sz w:val="24"/>
+        </w:rPr>
+        <w:t>8.3 Controls</w:t>
+      </w:r>
+    </w:p>
+    <w:p>
+      <w:r>
+        <w:rPr>
+          <w:sz w:val="24"/>
+        </w:rPr>
+        <w:t xml:space="preserve">        </w:t>
+      </w:r>
+      <w:r>
+        <w:rPr>
+          <w:sz w:val="24"/>
+        </w:rPr>
+        <w:tab/>
+      </w:r>
+      <w:r>
+        <w:rPr>
+          <w:sz w:val="24"/>
+        </w:rPr>
+        <w:t>Mouse controls only</w:t>
+      </w:r>
+      <w:r>
+        <w:rPr>
+          <w:sz w:val="24"/>
+        </w:rPr>
+        <w:t xml:space="preserve"> </w:t>
+      </w:r>
+      <w:r>
+        <w:rPr>
+          <w:sz w:val="24"/>
+        </w:rPr>
+        <w:t>(click, hold, drag)</w:t>
+      </w:r>
+      <w:r>
+        <w:rPr>
+          <w:sz w:val="24"/>
+        </w:rPr>
+        <w:t>.</w:t>
+      </w:r>
+    </w:p>
+    <w:p>
+      <w:r>
+        <w:rPr>
+          <w:sz w:val="24"/>
+        </w:rPr>
+        <w:t xml:space="preserve"> </w:t>
+      </w:r>
+    </w:p>
+    <w:p>
+      <w:r>
+        <w:rPr>
+          <w:sz w:val="24"/>
+        </w:rPr>
+        <w:t>8.4 Direct control</w:t>
+      </w:r>
+    </w:p>
+    <w:p>
+      <w:r>
+        <w:rPr>
+          <w:sz w:val="24"/>
+        </w:rPr>
+        <w:t xml:space="preserve">        </w:t>
+      </w:r>
+      <w:r>
+        <w:rPr>
+          <w:sz w:val="24"/>
+        </w:rPr>
+        <w:tab/>
+      </w:r>
+      <w:r>
+        <w:rPr>
+          <w:sz w:val="24"/>
+        </w:rPr>
+        <w:t>Mouse left click for selections, dragging, holding. Esc key for pause menu pop-up.</w:t>
+      </w:r>
+    </w:p>
+    <w:p>
+      <w:r>
+        <w:rPr>
+          <w:sz w:val="24"/>
+        </w:rPr>
+        <w:t xml:space="preserve"> </w:t>
+      </w:r>
+    </w:p>
+    <w:p>
+      <w:r>
+        <w:rPr>
+          <w:sz w:val="24"/>
+        </w:rPr>
+        <w:t>8.5 Indirect control</w:t>
+      </w:r>
+    </w:p>
+    <w:p>
+      <w:r>
+        <w:rPr>
+          <w:sz w:val="24"/>
+        </w:rPr>
+        <w:t xml:space="preserve">        </w:t>
+      </w:r>
+      <w:r>
+        <w:rPr>
+          <w:sz w:val="24"/>
+        </w:rPr>
+        <w:tab/>
+      </w:r>
+      <w:r>
+        <w:rPr>
+          <w:sz w:val="24"/>
+        </w:rPr>
+        <w:t xml:space="preserve">Order generation logic assigning NPC types to orders and selecting recipe to be made. </w:t>
+      </w:r>
+      <w:r>
+        <w:rPr>
+          <w:sz w:val="24"/>
+        </w:rPr>
+        <w:t>Patience of the customer being tied to time remaining on order.</w:t>
+      </w:r>
+    </w:p>
+    <w:p>
+      <w:r>
+        <w:rPr>
+          <w:sz w:val="24"/>
+        </w:rPr>
+        <w:t xml:space="preserve"> </w:t>
+      </w:r>
+    </w:p>
+    <w:p>
+      <w:pPr>
+        <w:pStyle w:val="Heading2"/>
+      </w:pPr>
+      <w:r>
+        <w:t>9. Supported hardware/platforms/devices</w:t>
+      </w:r>
+    </w:p>
+    <w:p>
+      <w:r>
+        <w:rPr>
+          <w:sz w:val="24"/>
+        </w:rPr>
+        <w:t xml:space="preserve">     </w:t>
+      </w:r>
+      <w:r>
+        <w:rPr>
+          <w:sz w:val="24"/>
+        </w:rPr>
+        <w:tab/>
+      </w:r>
+      <w:r>
+        <w:rPr>
+          <w:sz w:val="24"/>
+        </w:rPr>
+        <w:t xml:space="preserve">Keyboard and mouse only. </w:t>
+      </w:r>
+    </w:p>
+    <w:p>
+      <w:r>
+        <w:rPr>
+          <w:sz w:val="24"/>
+        </w:rPr>
+        <w:t xml:space="preserve"> </w:t>
+      </w:r>
+    </w:p>
+    <w:p>
+      <w:pPr>
+        <w:pStyle w:val="Heading2"/>
+      </w:pPr>
+      <w:r>
+        <w:t>10. Screens &amp; Menus</w:t>
+      </w:r>
+    </w:p>
+    <w:p>
+      <w:r>
+        <w:rPr>
+          <w:sz w:val="24"/>
+        </w:rPr>
+        <w:t>10.1 Splash Screen</w:t>
+      </w:r>
+    </w:p>
+    <w:p>
+      <w:r>
+        <w:rPr>
+          <w:sz w:val="24"/>
+        </w:rPr>
+        <w:t xml:space="preserve">        </w:t>
+      </w:r>
+      <w:r>
+        <w:rPr>
+          <w:sz w:val="24"/>
+        </w:rPr>
+        <w:tab/>
+      </w:r>
+      <w:r>
+        <w:rPr>
+          <w:sz w:val="24"/>
+        </w:rPr>
+        <w:t>Main menu</w:t>
+      </w:r>
+      <w:r>
+        <w:rPr>
+          <w:sz w:val="24"/>
+        </w:rPr>
+        <w:t xml:space="preserve"> (Play, settings, quit)</w:t>
+      </w:r>
+      <w:r>
+        <w:rPr>
+          <w:sz w:val="24"/>
+        </w:rPr>
+        <w:t>.</w:t>
+      </w:r>
+    </w:p>
+    <w:p>
+      <w:r>
+        <w:rPr>
+          <w:sz w:val="24"/>
+        </w:rPr>
+        <w:t xml:space="preserve"> </w:t>
+      </w:r>
+    </w:p>
+    <w:p>
+      <w:r>
+        <w:rPr>
+          <w:sz w:val="24"/>
+        </w:rPr>
+        <w:t>10.2 Game Interface</w:t>
+      </w:r>
+    </w:p>
+    <w:p>
+      <w:r>
+        <w:rPr>
+          <w:sz w:val="24"/>
+        </w:rPr>
         <w:lastRenderedPageBreak/>
+        <w:t xml:space="preserve">        </w:t>
+      </w:r>
+      <w:r>
+        <w:rPr>
+          <w:sz w:val="24"/>
+        </w:rPr>
         <w:tab/>
       </w:r>
       <w:r>
         <w:rPr>
           <w:sz w:val="24"/>
         </w:rPr>
-        <w:t>Target audience is 16+ due to the alcohol content included. No personal data collected. Only correct Copyright assets will be used (Creative Commons) with credits given. Disclaimer of alcohol content at start of the game.</w:t>
+        <w:t>Amount of money. NPC comments about service.</w:t>
+      </w:r>
+      <w:r>
+        <w:rPr>
+          <w:sz w:val="24"/>
+        </w:rPr>
+        <w:t xml:space="preserve"> Drink ingredients and glass to hold current drink. Reputation bar and current steps queue. Order tickets with timers and a recipe book with steps to make it other information.</w:t>
+      </w:r>
+    </w:p>
+    <w:p>
+      <w:r>
+        <w:rPr>
+          <w:sz w:val="24"/>
+        </w:rPr>
+        <w:t xml:space="preserve"> </w:t>
+      </w:r>
+    </w:p>
+    <w:p>
+      <w:r>
+        <w:rPr>
+          <w:sz w:val="24"/>
+        </w:rPr>
+        <w:t>10.3 Pause menu</w:t>
+      </w:r>
+    </w:p>
+    <w:p>
+      <w:r>
+        <w:rPr>
+          <w:sz w:val="24"/>
+        </w:rPr>
+        <w:t xml:space="preserve">        </w:t>
+      </w:r>
+      <w:r>
+        <w:rPr>
+          <w:sz w:val="24"/>
+        </w:rPr>
+        <w:tab/>
+      </w:r>
+      <w:r>
+        <w:rPr>
+          <w:sz w:val="24"/>
+        </w:rPr>
+        <w:t>Resume</w:t>
+      </w:r>
+      <w:r>
+        <w:rPr>
+          <w:sz w:val="24"/>
+        </w:rPr>
+        <w:t>, options</w:t>
+      </w:r>
+      <w:r>
+        <w:rPr>
+          <w:sz w:val="24"/>
+        </w:rPr>
+        <w:t xml:space="preserve"> and return to menu buttons.</w:t>
+      </w:r>
+    </w:p>
+    <w:p>
+      <w:r>
+        <w:rPr>
+          <w:sz w:val="24"/>
+        </w:rPr>
+        <w:t xml:space="preserve"> </w:t>
+      </w:r>
+    </w:p>
+    <w:p>
+      <w:r>
+        <w:rPr>
+          <w:sz w:val="24"/>
+        </w:rPr>
+        <w:t>10.4 Options</w:t>
+      </w:r>
+    </w:p>
+    <w:p>
+      <w:r>
+        <w:rPr>
+          <w:sz w:val="24"/>
+        </w:rPr>
+        <w:t xml:space="preserve">        </w:t>
+      </w:r>
+      <w:r>
+        <w:rPr>
+          <w:sz w:val="24"/>
+        </w:rPr>
+        <w:tab/>
+      </w:r>
+      <w:r>
+        <w:rPr>
+          <w:sz w:val="24"/>
+        </w:rPr>
+        <w:t xml:space="preserve">Game volume </w:t>
+      </w:r>
+      <w:r>
+        <w:rPr>
+          <w:sz w:val="24"/>
+        </w:rPr>
+        <w:t>slider to adjust sound volumes.</w:t>
+      </w:r>
+    </w:p>
+    <w:p>
+      <w:r>
+        <w:rPr>
+          <w:sz w:val="24"/>
+        </w:rPr>
+        <w:t xml:space="preserve"> </w:t>
+      </w:r>
+    </w:p>
+    <w:p>
+      <w:pPr>
+        <w:rPr>
+          <w:sz w:val="24"/>
+          <w:szCs w:val="24"/>
+        </w:rPr>
+      </w:pPr>
+      <w:r>
+        <w:rPr>
+          <w:sz w:val="24"/>
+          <w:szCs w:val="24"/>
+        </w:rPr>
+        <w:t>10.5 hub world</w:t>
+      </w:r>
+    </w:p>
+    <w:p>
+      <w:pPr>
+        <w:rPr>
+          <w:sz w:val="24"/>
+          <w:szCs w:val="24"/>
+        </w:rPr>
+      </w:pPr>
+      <w:r>
+        <w:rPr>
+          <w:sz w:val="24"/>
+          <w:szCs w:val="24"/>
+        </w:rPr>
+        <w:tab/>
+        <w:t>Previous nights performance with money made and lost due to rent. Upgrade purchasing list.</w:t>
+      </w:r>
+    </w:p>
+    <w:p>
+      <w:pPr>
+        <w:pStyle w:val="Heading2"/>
+      </w:pPr>
+      <w:r>
+        <w:t>11. Credits</w:t>
+      </w:r>
+    </w:p>
+    <w:p>
+      <w:pPr>
+        <w:rPr>
+          <w:b/>
+          <w:bCs/>
+          <w:sz w:val="24"/>
+        </w:rPr>
+      </w:pPr>
+      <w:r>
+        <w:rPr>
+          <w:b/>
+          <w:sz w:val="24"/>
+        </w:rPr>
+        <w:tab/>
+      </w:r>
+      <w:r>
+        <w:rPr>
+          <w:b/>
+          <w:bCs/>
+          <w:sz w:val="24"/>
+        </w:rPr>
+        <w:t>Audio</w:t>
+      </w:r>
+    </w:p>
+    <w:p>
+      <w:pPr>
+        <w:rPr>
+          <w:sz w:val="24"/>
+        </w:rPr>
+      </w:pPr>
+      <w:r>
+        <w:rPr>
+          <w:b/>
+          <w:bCs/>
+          <w:sz w:val="24"/>
+        </w:rPr>
+        <w:t>Background Music</w:t>
+      </w:r>
+    </w:p>
+    <w:p>
+      <w:pPr>
+        <w:numPr>
+          <w:ilvl w:val="0"/>
+          <w:numId w:val="1"/>
+        </w:numPr>
+        <w:rPr>
+          <w:sz w:val="24"/>
+        </w:rPr>
+      </w:pPr>
+      <w:r>
+        <w:rPr>
+          <w:i/>
+          <w:iCs/>
+          <w:sz w:val="24"/>
+        </w:rPr>
+        <w:t>“Tavern Loop One”</w:t>
+      </w:r>
+      <w:r>
+        <w:rPr>
+          <w:sz w:val="24"/>
+        </w:rPr>
+        <w:t> by Alexander Nakarada</w:t>
+      </w:r>
+      <w:r>
+        <w:rPr>
+          <w:sz w:val="24"/>
+        </w:rPr>
+        <w:br/>
+        <w:t>Source: </w:t>
+      </w:r>
+      <w:hyperlink r:id="rId11" w:tgtFrame="_new" w:history="1">
+        <w:r>
+          <w:rPr>
+            <w:rStyle w:val="Hyperlink"/>
+            <w:sz w:val="24"/>
+          </w:rPr>
+          <w:t>https://www.free-stock-music.com/alexander-nakarada-tavern-loop-one.html</w:t>
+        </w:r>
+      </w:hyperlink>
+      <w:r>
+        <w:rPr>
+          <w:sz w:val="24"/>
+        </w:rPr>
+        <w:br/>
+        <w:t>License: Free Stock Music License (attribution required)</w:t>
+      </w:r>
+    </w:p>
+    <w:p>
+      <w:pPr>
+        <w:rPr>
+          <w:sz w:val="24"/>
+        </w:rPr>
+      </w:pPr>
+      <w:r>
+        <w:rPr>
+          <w:b/>
+          <w:bCs/>
+          <w:sz w:val="24"/>
+        </w:rPr>
+        <w:t>Background Bar Chatter</w:t>
+      </w:r>
+    </w:p>
+    <w:p>
+      <w:pPr>
+        <w:numPr>
+          <w:ilvl w:val="0"/>
+          <w:numId w:val="2"/>
+        </w:numPr>
+        <w:rPr>
+          <w:sz w:val="24"/>
+        </w:rPr>
+      </w:pPr>
+      <w:r>
+        <w:rPr>
+          <w:sz w:val="24"/>
+        </w:rPr>
+        <w:t>“People Bar Chatter”</w:t>
+      </w:r>
+      <w:r>
+        <w:rPr>
+          <w:sz w:val="24"/>
+        </w:rPr>
+        <w:br/>
+        <w:t>Source: </w:t>
+      </w:r>
+      <w:hyperlink r:id="rId12" w:tgtFrame="_new" w:history="1">
+        <w:r>
+          <w:rPr>
+            <w:rStyle w:val="Hyperlink"/>
+            <w:sz w:val="24"/>
+          </w:rPr>
+          <w:t>https://pixabay.com/sound-effects/people-bar-chatter-5979/</w:t>
+        </w:r>
+      </w:hyperlink>
+      <w:r>
+        <w:rPr>
+          <w:sz w:val="24"/>
+        </w:rPr>
+        <w:br/>
+        <w:t xml:space="preserve">License: </w:t>
+      </w:r>
+      <w:proofErr w:type="spellStart"/>
+      <w:r>
+        <w:rPr>
+          <w:sz w:val="24"/>
+        </w:rPr>
+        <w:t>Pixabay</w:t>
+      </w:r>
+      <w:proofErr w:type="spellEnd"/>
+      <w:r>
+        <w:rPr>
+          <w:sz w:val="24"/>
+        </w:rPr>
+        <w:t xml:space="preserve"> License (free for use, no attribution required)</w:t>
+      </w:r>
+    </w:p>
+    <w:p>
+      <w:pPr>
+        <w:rPr>
+          <w:sz w:val="24"/>
+        </w:rPr>
+      </w:pPr>
+      <w:r>
+        <w:rPr>
+          <w:b/>
+          <w:bCs/>
+          <w:sz w:val="24"/>
+        </w:rPr>
+        <w:t>Bottle Pickup Sound</w:t>
+      </w:r>
+    </w:p>
+    <w:p>
+      <w:pPr>
+        <w:numPr>
+          <w:ilvl w:val="0"/>
+          <w:numId w:val="3"/>
+        </w:numPr>
+        <w:rPr>
+          <w:sz w:val="24"/>
+        </w:rPr>
+      </w:pPr>
+      <w:r>
+        <w:rPr>
+          <w:sz w:val="24"/>
+        </w:rPr>
+        <w:t>“Glasses Clinking”</w:t>
+      </w:r>
+      <w:r>
+        <w:rPr>
+          <w:sz w:val="24"/>
+        </w:rPr>
+        <w:br/>
+        <w:t>Source: </w:t>
+      </w:r>
+      <w:hyperlink r:id="rId13" w:tgtFrame="_new" w:history="1">
+        <w:r>
+          <w:rPr>
+            <w:rStyle w:val="Hyperlink"/>
+            <w:sz w:val="24"/>
+          </w:rPr>
+          <w:t>https://pixabay.com/sound-effects/film-special-effects-glasses-clinking-73558/</w:t>
+        </w:r>
+      </w:hyperlink>
+      <w:r>
+        <w:rPr>
+          <w:sz w:val="24"/>
+        </w:rPr>
+        <w:br/>
+        <w:t xml:space="preserve">License: </w:t>
+      </w:r>
+      <w:proofErr w:type="spellStart"/>
+      <w:r>
+        <w:rPr>
+          <w:sz w:val="24"/>
+        </w:rPr>
+        <w:t>Pixabay</w:t>
+      </w:r>
+      <w:proofErr w:type="spellEnd"/>
+      <w:r>
+        <w:rPr>
+          <w:sz w:val="24"/>
+        </w:rPr>
+        <w:t xml:space="preserve"> License</w:t>
+      </w:r>
+    </w:p>
+    <w:p>
+      <w:pPr>
+        <w:rPr>
+          <w:sz w:val="24"/>
+        </w:rPr>
+      </w:pPr>
+      <w:r>
+        <w:rPr>
+          <w:b/>
+          <w:bCs/>
+          <w:sz w:val="24"/>
+        </w:rPr>
+        <w:t>Ticket Fail Sound</w:t>
+      </w:r>
+    </w:p>
+    <w:p>
+      <w:pPr>
+        <w:numPr>
+          <w:ilvl w:val="0"/>
+          <w:numId w:val="4"/>
+        </w:numPr>
+        <w:rPr>
+          <w:sz w:val="24"/>
+        </w:rPr>
+      </w:pPr>
+      <w:r>
+        <w:rPr>
+          <w:sz w:val="24"/>
+        </w:rPr>
+        <w:t>“Paper Rip Twice”</w:t>
+      </w:r>
+      <w:r>
+        <w:rPr>
+          <w:sz w:val="24"/>
+        </w:rPr>
+        <w:br/>
+        <w:t>Source: </w:t>
+      </w:r>
+      <w:hyperlink r:id="rId14" w:tgtFrame="_new" w:history="1">
+        <w:r>
+          <w:rPr>
+            <w:rStyle w:val="Hyperlink"/>
+            <w:sz w:val="24"/>
+          </w:rPr>
+          <w:t>https://pixabay.com/sound-effects/film-special-effects-paper-rip-twice-252619/</w:t>
+        </w:r>
+      </w:hyperlink>
+      <w:r>
+        <w:rPr>
+          <w:sz w:val="24"/>
+        </w:rPr>
+        <w:br/>
+        <w:t xml:space="preserve">License: </w:t>
+      </w:r>
+      <w:proofErr w:type="spellStart"/>
+      <w:r>
+        <w:rPr>
+          <w:sz w:val="24"/>
+        </w:rPr>
+        <w:t>Pixabay</w:t>
+      </w:r>
+      <w:proofErr w:type="spellEnd"/>
+      <w:r>
+        <w:rPr>
+          <w:sz w:val="24"/>
+        </w:rPr>
+        <w:t xml:space="preserve"> License</w:t>
+      </w:r>
+    </w:p>
+    <w:p>
+      <w:pPr>
+        <w:rPr>
+          <w:sz w:val="24"/>
+        </w:rPr>
+      </w:pPr>
+      <w:r>
+        <w:rPr>
+          <w:b/>
+          <w:bCs/>
+          <w:sz w:val="24"/>
+        </w:rPr>
+        <w:t>Ticket Creation Sound</w:t>
+      </w:r>
+    </w:p>
+    <w:p>
+      <w:pPr>
+        <w:numPr>
+          <w:ilvl w:val="0"/>
+          <w:numId w:val="5"/>
+        </w:numPr>
+        <w:rPr>
+          <w:sz w:val="24"/>
+        </w:rPr>
+      </w:pPr>
+      <w:r>
+        <w:rPr>
+          <w:sz w:val="24"/>
+        </w:rPr>
+        <w:t>“Paper Sound Effect”</w:t>
+      </w:r>
+      <w:r>
+        <w:rPr>
+          <w:sz w:val="24"/>
+        </w:rPr>
+        <w:br/>
+        <w:t>Source: </w:t>
+      </w:r>
+      <w:hyperlink r:id="rId15" w:tgtFrame="_new" w:history="1">
+        <w:r>
+          <w:rPr>
+            <w:rStyle w:val="Hyperlink"/>
+            <w:sz w:val="24"/>
+          </w:rPr>
+          <w:t>https://pixabay.com/sound-effects/film-special-effects-paper-245786/</w:t>
+        </w:r>
+      </w:hyperlink>
+      <w:r>
+        <w:rPr>
+          <w:sz w:val="24"/>
+        </w:rPr>
+        <w:br/>
+        <w:t xml:space="preserve">License: </w:t>
+      </w:r>
+      <w:proofErr w:type="spellStart"/>
+      <w:r>
+        <w:rPr>
+          <w:sz w:val="24"/>
+        </w:rPr>
+        <w:t>Pixabay</w:t>
+      </w:r>
+      <w:proofErr w:type="spellEnd"/>
+      <w:r>
+        <w:rPr>
+          <w:sz w:val="24"/>
+        </w:rPr>
+        <w:t xml:space="preserve"> License</w:t>
+      </w:r>
+    </w:p>
+    <w:p>
+      <w:pPr>
+        <w:rPr>
+          <w:sz w:val="24"/>
+        </w:rPr>
+      </w:pPr>
+      <w:r>
+        <w:rPr>
+          <w:b/>
+          <w:bCs/>
+          <w:sz w:val="24"/>
+        </w:rPr>
+        <w:t>Drink Restart Sound</w:t>
+      </w:r>
+    </w:p>
+    <w:p>
+      <w:pPr>
+        <w:numPr>
+          <w:ilvl w:val="0"/>
+          <w:numId w:val="6"/>
+        </w:numPr>
+        <w:rPr>
+          <w:sz w:val="24"/>
+        </w:rPr>
+      </w:pPr>
+      <w:r>
+        <w:rPr>
+          <w:sz w:val="24"/>
+        </w:rPr>
+        <w:t>“Slurping Sound”</w:t>
+      </w:r>
+      <w:r>
+        <w:rPr>
+          <w:sz w:val="24"/>
+        </w:rPr>
+        <w:br/>
+        <w:t>Source: </w:t>
+      </w:r>
+      <w:hyperlink r:id="rId16" w:tgtFrame="_new" w:history="1">
+        <w:r>
+          <w:rPr>
+            <w:rStyle w:val="Hyperlink"/>
+            <w:sz w:val="24"/>
+          </w:rPr>
+          <w:t>https://pixabay.com/sound-effects/people-slurping-sound-335897/</w:t>
+        </w:r>
+      </w:hyperlink>
+      <w:r>
+        <w:rPr>
+          <w:sz w:val="24"/>
+        </w:rPr>
+        <w:br/>
+        <w:t xml:space="preserve">License: </w:t>
+      </w:r>
+      <w:proofErr w:type="spellStart"/>
+      <w:r>
+        <w:rPr>
+          <w:sz w:val="24"/>
+        </w:rPr>
+        <w:t>Pixabay</w:t>
+      </w:r>
+      <w:proofErr w:type="spellEnd"/>
+      <w:r>
+        <w:rPr>
+          <w:sz w:val="24"/>
+        </w:rPr>
+        <w:t xml:space="preserve"> License</w:t>
+      </w:r>
+    </w:p>
+    <w:p>
+      <w:pPr>
+        <w:rPr>
+          <w:b/>
+          <w:bCs/>
+          <w:sz w:val="24"/>
+        </w:rPr>
+      </w:pPr>
+      <w:r>
+        <w:rPr>
+          <w:b/>
+          <w:bCs/>
+          <w:sz w:val="24"/>
+        </w:rPr>
+        <w:t>Visual Assets</w:t>
+      </w:r>
+    </w:p>
+    <w:p>
+      <w:pPr>
+        <w:rPr>
+          <w:sz w:val="24"/>
+        </w:rPr>
+      </w:pPr>
+      <w:r>
+        <w:rPr>
+          <w:b/>
+          <w:bCs/>
+          <w:sz w:val="24"/>
+        </w:rPr>
+        <w:t>Lemon Slice Icon</w:t>
+      </w:r>
+    </w:p>
+    <w:p>
+      <w:pPr>
+        <w:numPr>
+          <w:ilvl w:val="0"/>
+          <w:numId w:val="7"/>
+        </w:numPr>
+        <w:rPr>
+          <w:sz w:val="24"/>
+        </w:rPr>
+      </w:pPr>
+      <w:r>
+        <w:rPr>
+          <w:sz w:val="24"/>
+        </w:rPr>
+        <w:t>Source: </w:t>
+      </w:r>
+      <w:hyperlink r:id="rId17" w:tgtFrame="_new" w:history="1">
+        <w:r>
+          <w:rPr>
+            <w:rStyle w:val="Hyperlink"/>
+            <w:sz w:val="24"/>
+          </w:rPr>
+          <w:t>https://www.freepik.com/free-vector/slice-lemon-icon-isolated-design_74221270.htm</w:t>
+        </w:r>
+      </w:hyperlink>
+      <w:r>
+        <w:rPr>
+          <w:sz w:val="24"/>
+        </w:rPr>
+        <w:br/>
+        <w:t xml:space="preserve">Author: </w:t>
+      </w:r>
+      <w:proofErr w:type="spellStart"/>
+      <w:r>
+        <w:rPr>
+          <w:sz w:val="24"/>
+        </w:rPr>
+        <w:t>Freepik</w:t>
+      </w:r>
+      <w:proofErr w:type="spellEnd"/>
+      <w:r>
+        <w:rPr>
+          <w:sz w:val="24"/>
+        </w:rPr>
+        <w:br/>
+        <w:t xml:space="preserve">License: </w:t>
+      </w:r>
+      <w:proofErr w:type="spellStart"/>
+      <w:r>
+        <w:rPr>
+          <w:sz w:val="24"/>
+        </w:rPr>
+        <w:t>Freepik</w:t>
+      </w:r>
+      <w:proofErr w:type="spellEnd"/>
+      <w:r>
+        <w:rPr>
+          <w:sz w:val="24"/>
+        </w:rPr>
+        <w:t xml:space="preserve"> License (attribution required)</w:t>
+      </w:r>
+    </w:p>
+    <w:p>
+      <w:pPr>
+        <w:rPr>
+          <w:sz w:val="24"/>
+        </w:rPr>
+      </w:pPr>
+      <w:r>
+        <w:rPr>
+          <w:b/>
+          <w:bCs/>
+          <w:sz w:val="24"/>
+        </w:rPr>
+        <w:lastRenderedPageBreak/>
+        <w:t>Ice Cubes Illustration</w:t>
+      </w:r>
+    </w:p>
+    <w:p>
+      <w:pPr>
+        <w:numPr>
+          <w:ilvl w:val="0"/>
+          <w:numId w:val="8"/>
+        </w:numPr>
+        <w:rPr>
+          <w:sz w:val="24"/>
+        </w:rPr>
+      </w:pPr>
+      <w:r>
+        <w:rPr>
+          <w:sz w:val="24"/>
+        </w:rPr>
+        <w:t>Source: </w:t>
+      </w:r>
+      <w:hyperlink r:id="rId18" w:tgtFrame="_new" w:history="1">
+        <w:r>
+          <w:rPr>
+            <w:rStyle w:val="Hyperlink"/>
+            <w:sz w:val="24"/>
+          </w:rPr>
+          <w:t>https://www.freepik.com/free-vector/pile-ice-melting-white_6822595.htm</w:t>
+        </w:r>
+      </w:hyperlink>
+      <w:r>
+        <w:rPr>
+          <w:sz w:val="24"/>
+        </w:rPr>
+        <w:br/>
+        <w:t xml:space="preserve">Author: </w:t>
+      </w:r>
+      <w:proofErr w:type="spellStart"/>
+      <w:r>
+        <w:rPr>
+          <w:sz w:val="24"/>
+        </w:rPr>
+        <w:t>Freepik</w:t>
+      </w:r>
+      <w:proofErr w:type="spellEnd"/>
+      <w:r>
+        <w:rPr>
+          <w:sz w:val="24"/>
+        </w:rPr>
+        <w:br/>
+        <w:t xml:space="preserve">License: </w:t>
+      </w:r>
+      <w:proofErr w:type="spellStart"/>
+      <w:r>
+        <w:rPr>
+          <w:sz w:val="24"/>
+        </w:rPr>
+        <w:t>Freepik</w:t>
+      </w:r>
+      <w:proofErr w:type="spellEnd"/>
+      <w:r>
+        <w:rPr>
+          <w:sz w:val="24"/>
+        </w:rPr>
+        <w:t xml:space="preserve"> License (attribution required)</w:t>
+      </w:r>
+    </w:p>
+    <w:p>
+      <w:pPr>
+        <w:rPr>
+          <w:sz w:val="24"/>
+        </w:rPr>
+      </w:pPr>
+      <w:r>
+        <w:rPr>
+          <w:b/>
+          <w:bCs/>
+          <w:sz w:val="24"/>
+        </w:rPr>
+        <w:t>Mint Leaves Illustration</w:t>
+      </w:r>
+    </w:p>
+    <w:p>
+      <w:pPr>
+        <w:numPr>
+          <w:ilvl w:val="0"/>
+          <w:numId w:val="9"/>
+        </w:numPr>
+        <w:rPr>
+          <w:sz w:val="24"/>
+        </w:rPr>
+      </w:pPr>
+      <w:r>
+        <w:rPr>
+          <w:sz w:val="24"/>
+        </w:rPr>
+        <w:t>Source: </w:t>
+      </w:r>
+      <w:hyperlink r:id="rId19" w:tgtFrame="_new" w:history="1">
+        <w:r>
+          <w:rPr>
+            <w:rStyle w:val="Hyperlink"/>
+            <w:sz w:val="24"/>
+          </w:rPr>
+          <w:t>https://www.freepik.com/free-vector/mint-vector-leaves-plant-mint-green-leaf-mint-organic-fresh-mint-illustration_11059478.htm</w:t>
+        </w:r>
+      </w:hyperlink>
+      <w:r>
+        <w:rPr>
+          <w:sz w:val="24"/>
+        </w:rPr>
+        <w:br/>
+        <w:t xml:space="preserve">Author: </w:t>
+      </w:r>
+      <w:proofErr w:type="spellStart"/>
+      <w:r>
+        <w:rPr>
+          <w:sz w:val="24"/>
+        </w:rPr>
+        <w:t>Freepik</w:t>
+      </w:r>
+      <w:proofErr w:type="spellEnd"/>
+      <w:r>
+        <w:rPr>
+          <w:sz w:val="24"/>
+        </w:rPr>
+        <w:br/>
+        <w:t xml:space="preserve">License: </w:t>
+      </w:r>
+      <w:proofErr w:type="spellStart"/>
+      <w:r>
+        <w:rPr>
+          <w:sz w:val="24"/>
+        </w:rPr>
+        <w:t>Freepik</w:t>
+      </w:r>
+      <w:proofErr w:type="spellEnd"/>
+      <w:r>
+        <w:rPr>
+          <w:sz w:val="24"/>
+        </w:rPr>
+        <w:t xml:space="preserve"> License (attribution required)</w:t>
+      </w:r>
+    </w:p>
+    <w:p>
+      <w:pPr>
+        <w:rPr>
+          <w:b/>
+          <w:bCs/>
+          <w:sz w:val="24"/>
+        </w:rPr>
+      </w:pPr>
+      <w:r>
+        <w:rPr>
+          <w:b/>
+          <w:bCs/>
+          <w:sz w:val="24"/>
+        </w:rPr>
+        <w:t>3D Assets</w:t>
+      </w:r>
+    </w:p>
+    <w:p>
+      <w:pPr>
+        <w:rPr>
+          <w:sz w:val="24"/>
+        </w:rPr>
+      </w:pPr>
+      <w:r>
+        <w:rPr>
+          <w:b/>
+          <w:bCs/>
+          <w:sz w:val="24"/>
+        </w:rPr>
+        <w:t>Spoon Model</w:t>
+      </w:r>
+    </w:p>
+    <w:p>
+      <w:pPr>
+        <w:numPr>
+          <w:ilvl w:val="0"/>
+          <w:numId w:val="10"/>
+        </w:numPr>
+        <w:rPr>
+          <w:sz w:val="24"/>
+        </w:rPr>
+      </w:pPr>
+      <w:r>
+        <w:rPr>
+          <w:sz w:val="24"/>
+        </w:rPr>
+        <w:t>“Cutlery / Silverware PBR”</w:t>
+      </w:r>
+      <w:r>
+        <w:rPr>
+          <w:sz w:val="24"/>
+        </w:rPr>
+        <w:br/>
+        <w:t>Source: </w:t>
+      </w:r>
+      <w:hyperlink r:id="rId20" w:tgtFrame="_new" w:history="1">
+        <w:r>
+          <w:rPr>
+            <w:rStyle w:val="Hyperlink"/>
+            <w:sz w:val="24"/>
+          </w:rPr>
+          <w:t>https://assetstore.unity.com/packages/3d/props/food/cutlery-silverware-pbr-106932</w:t>
+        </w:r>
+      </w:hyperlink>
+      <w:r>
+        <w:rPr>
+          <w:sz w:val="24"/>
+        </w:rPr>
+        <w:br/>
+        <w:t>License: Unity Asset Store License</w:t>
+      </w:r>
+    </w:p>
+    <w:p>
+      <w:pPr>
+        <w:rPr>
+          <w:sz w:val="24"/>
+        </w:rPr>
+      </w:pPr>
+      <w:r>
+        <w:rPr>
+          <w:b/>
+          <w:bCs/>
+          <w:sz w:val="24"/>
+        </w:rPr>
+        <w:t>Environment Assets</w:t>
+      </w:r>
+    </w:p>
+    <w:p>
+      <w:pPr>
+        <w:numPr>
+          <w:ilvl w:val="0"/>
+          <w:numId w:val="11"/>
+        </w:numPr>
+        <w:rPr>
+          <w:sz w:val="24"/>
+        </w:rPr>
+      </w:pPr>
+      <w:r>
+        <w:rPr>
+          <w:sz w:val="24"/>
+        </w:rPr>
+        <w:t>“Fries and Seagulls – Bar/Interior” (Unity Asset Store)</w:t>
+      </w:r>
+      <w:r>
+        <w:rPr>
+          <w:sz w:val="24"/>
+        </w:rPr>
+        <w:br/>
+        <w:t>License: Unity Asset Store License</w:t>
       </w:r>
     </w:p>
     <w:p/>
-    <w:p>
-      <w:pPr>
-        <w:pStyle w:val="Heading2"/>
-      </w:pPr>
-      <w:r>
-        <w:t>8. Gameplay</w:t>
-      </w:r>
-    </w:p>
-    <w:p>
-      <w:pPr>
-        <w:rPr>
-          <w:sz w:val="24"/>
-        </w:rPr>
-      </w:pPr>
-    </w:p>
-    <w:p>
-      <w:r>
-        <w:rPr>
-          <w:sz w:val="24"/>
-        </w:rPr>
-        <w:t>8.1 World</w:t>
-      </w:r>
-    </w:p>
-    <w:p>
-      <w:pPr>
-        <w:ind w:firstLine="720"/>
-      </w:pPr>
-      <w:r>
-        <w:rPr>
-          <w:sz w:val="24"/>
-        </w:rPr>
-        <w:t>A late medieval tavern scene of mainly the bar area which is where the ingredients will be stored. Some background scene will be included to show NPC’s ordering and their feedback and price they pay.</w:t>
-      </w:r>
-    </w:p>
-    <w:p>
-      <w:r>
-        <w:rPr>
-          <w:sz w:val="24"/>
-        </w:rPr>
-        <w:t xml:space="preserve"> </w:t>
-      </w:r>
-    </w:p>
-    <w:p>
-      <w:r>
-        <w:rPr>
-          <w:sz w:val="24"/>
-        </w:rPr>
-        <w:t>8.2 Object types</w:t>
-      </w:r>
-    </w:p>
-    <w:p>
-      <w:r>
-        <w:rPr>
-          <w:sz w:val="24"/>
-        </w:rPr>
-        <w:t xml:space="preserve">        </w:t>
-      </w:r>
-      <w:r>
-        <w:rPr>
-          <w:sz w:val="24"/>
-        </w:rPr>
-        <w:tab/>
-      </w:r>
-      <w:r>
-        <w:rPr>
-          <w:sz w:val="24"/>
-        </w:rPr>
-        <w:t>The player will be able to interact with the ingredients such as the alcohol, mixers, ice, garnishes, the glass the drink will be served in, the mixing instruments and the order tickets and serving area.</w:t>
-      </w:r>
-    </w:p>
-    <w:p>
-      <w:r>
-        <w:rPr>
-          <w:sz w:val="24"/>
-        </w:rPr>
-        <w:t xml:space="preserve"> </w:t>
-      </w:r>
-    </w:p>
-    <w:p>
-      <w:r>
-        <w:rPr>
-          <w:sz w:val="24"/>
-        </w:rPr>
-        <w:t>8.3 Controls</w:t>
-      </w:r>
-    </w:p>
-    <w:p>
-      <w:r>
-        <w:rPr>
-          <w:sz w:val="24"/>
-        </w:rPr>
-        <w:t xml:space="preserve">        </w:t>
-      </w:r>
-      <w:r>
-        <w:rPr>
-          <w:sz w:val="24"/>
-        </w:rPr>
-        <w:tab/>
-      </w:r>
-      <w:r>
-        <w:rPr>
-          <w:sz w:val="24"/>
-        </w:rPr>
-        <w:t>Mouse controls only.</w:t>
-      </w:r>
-    </w:p>
-    <w:p>
-      <w:r>
-        <w:rPr>
-          <w:sz w:val="24"/>
-        </w:rPr>
-        <w:t xml:space="preserve"> </w:t>
-      </w:r>
-    </w:p>
-    <w:p>
-      <w:r>
-        <w:rPr>
-          <w:sz w:val="24"/>
-        </w:rPr>
-        <w:t>8.4 Direct control</w:t>
-      </w:r>
-    </w:p>
-    <w:p>
-      <w:r>
-        <w:rPr>
-          <w:sz w:val="24"/>
-        </w:rPr>
-        <w:t xml:space="preserve">        </w:t>
-      </w:r>
-      <w:r>
-        <w:rPr>
-          <w:sz w:val="24"/>
-        </w:rPr>
-        <w:tab/>
-      </w:r>
-      <w:r>
-        <w:rPr>
-          <w:sz w:val="24"/>
-          <w:highlight w:val="yellow"/>
-        </w:rPr>
-        <w:t>Explanation of controls. (diagram)</w:t>
-      </w:r>
-    </w:p>
-    <w:p>
-      <w:r>
-        <w:rPr>
-          <w:sz w:val="24"/>
-        </w:rPr>
-        <w:t xml:space="preserve"> </w:t>
-      </w:r>
-    </w:p>
-    <w:p>
-      <w:r>
-        <w:rPr>
-          <w:sz w:val="24"/>
-        </w:rPr>
-        <w:t>8.5 Indirect control</w:t>
-      </w:r>
-    </w:p>
-    <w:p>
-      <w:r>
-        <w:rPr>
-          <w:sz w:val="24"/>
-        </w:rPr>
-        <w:t xml:space="preserve">        </w:t>
-      </w:r>
-      <w:r>
-        <w:rPr>
-          <w:sz w:val="24"/>
-        </w:rPr>
-        <w:tab/>
-      </w:r>
-      <w:r>
-        <w:rPr>
-          <w:sz w:val="24"/>
-          <w:highlight w:val="yellow"/>
-        </w:rPr>
-        <w:t>AI or other types of indirect control.</w:t>
-      </w:r>
-    </w:p>
-    <w:p>
-      <w:r>
-        <w:rPr>
-          <w:sz w:val="24"/>
-        </w:rPr>
-        <w:t xml:space="preserve"> </w:t>
-      </w:r>
-    </w:p>
-    <w:p>
-      <w:pPr>
-        <w:pStyle w:val="Heading2"/>
-      </w:pPr>
-      <w:r>
-        <w:t>9. Supported hardware/platforms/devices</w:t>
-      </w:r>
-    </w:p>
-    <w:p>
-      <w:r>
-        <w:rPr>
-          <w:sz w:val="24"/>
-        </w:rPr>
-        <w:t xml:space="preserve">     </w:t>
-      </w:r>
-      <w:r>
-        <w:rPr>
-          <w:sz w:val="24"/>
-        </w:rPr>
-        <w:tab/>
-        <w:t>Types of joysticks, steering wheels...</w:t>
-      </w:r>
-    </w:p>
-    <w:p>
-      <w:r>
-        <w:rPr>
-          <w:sz w:val="24"/>
-        </w:rPr>
-        <w:t xml:space="preserve"> </w:t>
-      </w:r>
-    </w:p>
-    <w:p>
-      <w:pPr>
-        <w:pStyle w:val="Heading2"/>
-      </w:pPr>
-      <w:r>
-        <w:t>10. Screens &amp; Menus</w:t>
-      </w:r>
-    </w:p>
-    <w:p>
-      <w:r>
-        <w:rPr>
-          <w:sz w:val="24"/>
-        </w:rPr>
-        <w:t>10.1 Splash Screen</w:t>
-      </w:r>
-    </w:p>
-    <w:p>
-      <w:r>
-        <w:rPr>
-          <w:sz w:val="24"/>
-        </w:rPr>
-        <w:t xml:space="preserve">        </w:t>
-      </w:r>
-      <w:r>
-        <w:rPr>
-          <w:sz w:val="24"/>
-        </w:rPr>
-        <w:tab/>
-      </w:r>
-      <w:r>
-        <w:rPr>
-          <w:sz w:val="24"/>
-        </w:rPr>
-        <w:t>Main menu.</w:t>
-      </w:r>
-    </w:p>
-    <w:p>
-      <w:r>
-        <w:rPr>
-          <w:sz w:val="24"/>
-        </w:rPr>
-        <w:t xml:space="preserve"> </w:t>
-      </w:r>
-    </w:p>
-    <w:p>
-      <w:r>
-        <w:rPr>
-          <w:sz w:val="24"/>
-        </w:rPr>
-        <w:t>10.2 Game Interface</w:t>
-      </w:r>
-    </w:p>
-    <w:p>
-      <w:r>
-        <w:rPr>
-          <w:sz w:val="24"/>
-        </w:rPr>
-        <w:t xml:space="preserve">        </w:t>
-      </w:r>
-      <w:r>
-        <w:rPr>
-          <w:sz w:val="24"/>
-        </w:rPr>
-        <w:tab/>
-      </w:r>
-      <w:r>
-        <w:rPr>
-          <w:sz w:val="24"/>
-        </w:rPr>
-        <w:t>Amount of money. NPC comments about service. Hub world menu with night overview and upgrade purchasing.</w:t>
-      </w:r>
-    </w:p>
-    <w:p>
-      <w:r>
-        <w:rPr>
-          <w:sz w:val="24"/>
-        </w:rPr>
-        <w:t xml:space="preserve"> </w:t>
-      </w:r>
-    </w:p>
-    <w:p>
-      <w:r>
-        <w:rPr>
-          <w:sz w:val="24"/>
-        </w:rPr>
-        <w:t>10.3 Pause menu</w:t>
-      </w:r>
-    </w:p>
-    <w:p>
-      <w:r>
-        <w:rPr>
-          <w:sz w:val="24"/>
-        </w:rPr>
-        <w:t xml:space="preserve">        </w:t>
-      </w:r>
-      <w:r>
-        <w:rPr>
-          <w:sz w:val="24"/>
-        </w:rPr>
-        <w:tab/>
-      </w:r>
-      <w:r>
-        <w:rPr>
-          <w:sz w:val="24"/>
-        </w:rPr>
-        <w:t>Resume and return to menu buttons.</w:t>
-      </w:r>
-    </w:p>
-    <w:p>
-      <w:r>
-        <w:rPr>
-          <w:sz w:val="24"/>
-        </w:rPr>
-        <w:t xml:space="preserve"> </w:t>
-      </w:r>
-    </w:p>
-    <w:p>
-      <w:r>
-        <w:rPr>
-          <w:sz w:val="24"/>
-        </w:rPr>
-        <w:t>10.4 Options</w:t>
-      </w:r>
-    </w:p>
-    <w:p>
-      <w:r>
-        <w:rPr>
-          <w:sz w:val="24"/>
-        </w:rPr>
-        <w:t xml:space="preserve">        </w:t>
-      </w:r>
-      <w:r>
-        <w:rPr>
-          <w:sz w:val="24"/>
-        </w:rPr>
-        <w:tab/>
-      </w:r>
-      <w:r>
-        <w:rPr>
-          <w:sz w:val="24"/>
-        </w:rPr>
-        <w:t>SFX slider and Music slider to adjust sound volumes.</w:t>
-      </w:r>
-    </w:p>
-    <w:p>
-      <w:r>
-        <w:rPr>
-          <w:sz w:val="24"/>
-        </w:rPr>
-        <w:t xml:space="preserve"> </w:t>
-      </w:r>
-    </w:p>
-    <w:p>
-      <w:r>
-        <w:rPr>
-          <w:sz w:val="24"/>
-        </w:rPr>
-        <w:t>10.5 Game Over</w:t>
-      </w:r>
-    </w:p>
-    <w:p>
-      <w:r>
-        <w:rPr>
-          <w:sz w:val="24"/>
-        </w:rPr>
-        <w:t xml:space="preserve">        </w:t>
-      </w:r>
-      <w:r>
-        <w:rPr>
-          <w:sz w:val="24"/>
-        </w:rPr>
-        <w:tab/>
-      </w:r>
-      <w:r>
-        <w:rPr>
-          <w:sz w:val="24"/>
-        </w:rPr>
-        <w:t xml:space="preserve">Triggered when rent </w:t>
-      </w:r>
-      <w:proofErr w:type="gramStart"/>
-      <w:r>
-        <w:rPr>
-          <w:sz w:val="24"/>
-        </w:rPr>
-        <w:t>cant</w:t>
-      </w:r>
-      <w:proofErr w:type="gramEnd"/>
-      <w:r>
-        <w:rPr>
-          <w:sz w:val="24"/>
-        </w:rPr>
-        <w:t xml:space="preserve"> be paid. Game overview stats such as drinks served money earned and night you made it to.</w:t>
-      </w:r>
-    </w:p>
-    <w:p/>
-    <w:p>
-      <w:pPr>
-        <w:pStyle w:val="Heading2"/>
-      </w:pPr>
-      <w:r>
-        <w:t>11. Credits</w:t>
-      </w:r>
-    </w:p>
-    <w:p>
-      <w:r>
-        <w:rPr>
-          <w:b/>
-          <w:sz w:val="24"/>
-        </w:rPr>
-        <w:tab/>
-      </w:r>
-      <w:r>
-        <w:rPr>
-          <w:sz w:val="24"/>
-          <w:highlight w:val="yellow"/>
-        </w:rPr>
-        <w:t>Credit 3rd party resources; tutorials, asset store, libraries</w:t>
-      </w:r>
-    </w:p>
     <w:p>
       <w:r>
         <w:rPr>
@@ -2133,7 +3455,7 @@
 </file>
 
 <file path=word/endnotes.xml><?xml version="1.0" encoding="utf-8"?>
-<w:endnotes xmlns:wpc="http://schemas.microsoft.com/office/word/2010/wordprocessingCanvas" xmlns:cx="http://schemas.microsoft.com/office/drawing/2014/chartex" xmlns:cx1="http://schemas.microsoft.com/office/drawing/2015/9/8/chartex" xmlns:cx2="http://schemas.microsoft.com/office/drawing/2015/10/21/chartex" xmlns:cx3="http://schemas.microsoft.com/office/drawing/2016/5/9/chartex" xmlns:cx4="http://schemas.microsoft.com/office/drawing/2016/5/10/chartex" xmlns:cx5="http://schemas.microsoft.com/office/drawing/2016/5/11/chartex" xmlns:cx6="http://schemas.microsoft.com/office/drawing/2016/5/12/chartex" xmlns:cx7="http://schemas.microsoft.com/office/drawing/2016/5/13/chartex" xmlns:cx8="http://schemas.microsoft.com/office/drawing/2016/5/14/chartex" xmlns:mc="http://schemas.openxmlformats.org/markup-compatibility/2006" xmlns:aink="http://schemas.microsoft.com/office/drawing/2016/ink" xmlns:am3d="http://schemas.microsoft.com/office/drawing/2017/model3d" xmlns:o="urn:schemas-microsoft-com:office:office" xmlns:r="http://schemas.openxmlformats.org/officeDocument/2006/relationships" xmlns:m="http://schemas.openxmlformats.org/officeDocument/2006/math" xmlns:v="urn:schemas-microsoft-com:vml" xmlns:wp14="http://schemas.microsoft.com/office/word/2010/wordprocessingDrawing" xmlns:wp="http://schemas.openxmlformats.org/drawingml/2006/wordprocessingDrawing" xmlns:w10="urn:schemas-microsoft-com:office:word" xmlns:w="http://schemas.openxmlformats.org/wordprocessingml/2006/main" xmlns:w14="http://schemas.microsoft.com/office/word/2010/wordml" xmlns:w15="http://schemas.microsoft.com/office/word/2012/wordml" xmlns:w16cid="http://schemas.microsoft.com/office/word/2016/wordml/cid" xmlns:w16se="http://schemas.microsoft.com/office/word/2015/wordml/symex" xmlns:wpg="http://schemas.microsoft.com/office/word/2010/wordprocessingGroup" xmlns:wpi="http://schemas.microsoft.com/office/word/2010/wordprocessingInk" xmlns:wne="http://schemas.microsoft.com/office/word/2006/wordml" xmlns:wps="http://schemas.microsoft.com/office/word/2010/wordprocessingShape" mc:Ignorable="w14 w15 w16se w16cid wp14">
+<w:endnotes xmlns:wpc="http://schemas.microsoft.com/office/word/2010/wordprocessingCanvas" xmlns:cx="http://schemas.microsoft.com/office/drawing/2014/chartex" xmlns:cx1="http://schemas.microsoft.com/office/drawing/2015/9/8/chartex" xmlns:cx2="http://schemas.microsoft.com/office/drawing/2015/10/21/chartex" xmlns:cx3="http://schemas.microsoft.com/office/drawing/2016/5/9/chartex" xmlns:cx4="http://schemas.microsoft.com/office/drawing/2016/5/10/chartex" xmlns:cx5="http://schemas.microsoft.com/office/drawing/2016/5/11/chartex" xmlns:cx6="http://schemas.microsoft.com/office/drawing/2016/5/12/chartex" xmlns:cx7="http://schemas.microsoft.com/office/drawing/2016/5/13/chartex" xmlns:cx8="http://schemas.microsoft.com/office/drawing/2016/5/14/chartex" xmlns:mc="http://schemas.openxmlformats.org/markup-compatibility/2006" xmlns:aink="http://schemas.microsoft.com/office/drawing/2016/ink" xmlns:am3d="http://schemas.microsoft.com/office/drawing/2017/model3d" xmlns:o="urn:schemas-microsoft-com:office:office" xmlns:oel="http://schemas.microsoft.com/office/2019/extlst" xmlns:r="http://schemas.openxmlformats.org/officeDocument/2006/relationships" xmlns:m="http://schemas.openxmlformats.org/officeDocument/2006/math" xmlns:v="urn:schemas-microsoft-com:vml" xmlns:wp14="http://schemas.microsoft.com/office/word/2010/wordprocessingDrawing" xmlns:wp="http://schemas.openxmlformats.org/drawingml/2006/wordprocessingDrawing" xmlns:w10="urn:schemas-microsoft-com:office:word" xmlns:w="http://schemas.openxmlformats.org/wordprocessingml/2006/main" xmlns:w14="http://schemas.microsoft.com/office/word/2010/wordml" xmlns:w15="http://schemas.microsoft.com/office/word/2012/wordml" xmlns:w16cex="http://schemas.microsoft.com/office/word/2018/wordml/cex" xmlns:w16cid="http://schemas.microsoft.com/office/word/2016/wordml/cid" xmlns:w16="http://schemas.microsoft.com/office/word/2018/wordml" xmlns:w16du="http://schemas.microsoft.com/office/word/2023/wordml/word16du" xmlns:w16sdtdh="http://schemas.microsoft.com/office/word/2020/wordml/sdtdatahash" xmlns:w16sdtfl="http://schemas.microsoft.com/office/word/2024/wordml/sdtformatlock" xmlns:w16se="http://schemas.microsoft.com/office/word/2015/wordml/symex" xmlns:wpg="http://schemas.microsoft.com/office/word/2010/wordprocessingGroup" xmlns:wpi="http://schemas.microsoft.com/office/word/2010/wordprocessingInk" xmlns:wne="http://schemas.microsoft.com/office/word/2006/wordml" xmlns:wps="http://schemas.microsoft.com/office/word/2010/wordprocessingShape" mc:Ignorable="w14 w15 w16se w16cid w16 w16cex w16sdtdh w16sdtfl w16du wp14">
   <w:endnote w:type="separator" w:id="-1">
     <w:p>
       <w:pPr>
@@ -2158,7 +3480,7 @@
 </file>
 
 <file path=word/footnotes.xml><?xml version="1.0" encoding="utf-8"?>
-<w:footnotes xmlns:wpc="http://schemas.microsoft.com/office/word/2010/wordprocessingCanvas" xmlns:cx="http://schemas.microsoft.com/office/drawing/2014/chartex" xmlns:cx1="http://schemas.microsoft.com/office/drawing/2015/9/8/chartex" xmlns:cx2="http://schemas.microsoft.com/office/drawing/2015/10/21/chartex" xmlns:cx3="http://schemas.microsoft.com/office/drawing/2016/5/9/chartex" xmlns:cx4="http://schemas.microsoft.com/office/drawing/2016/5/10/chartex" xmlns:cx5="http://schemas.microsoft.com/office/drawing/2016/5/11/chartex" xmlns:cx6="http://schemas.microsoft.com/office/drawing/2016/5/12/chartex" xmlns:cx7="http://schemas.microsoft.com/office/drawing/2016/5/13/chartex" xmlns:cx8="http://schemas.microsoft.com/office/drawing/2016/5/14/chartex" xmlns:mc="http://schemas.openxmlformats.org/markup-compatibility/2006" xmlns:aink="http://schemas.microsoft.com/office/drawing/2016/ink" xmlns:am3d="http://schemas.microsoft.com/office/drawing/2017/model3d" xmlns:o="urn:schemas-microsoft-com:office:office" xmlns:r="http://schemas.openxmlformats.org/officeDocument/2006/relationships" xmlns:m="http://schemas.openxmlformats.org/officeDocument/2006/math" xmlns:v="urn:schemas-microsoft-com:vml" xmlns:wp14="http://schemas.microsoft.com/office/word/2010/wordprocessingDrawing" xmlns:wp="http://schemas.openxmlformats.org/drawingml/2006/wordprocessingDrawing" xmlns:w10="urn:schemas-microsoft-com:office:word" xmlns:w="http://schemas.openxmlformats.org/wordprocessingml/2006/main" xmlns:w14="http://schemas.microsoft.com/office/word/2010/wordml" xmlns:w15="http://schemas.microsoft.com/office/word/2012/wordml" xmlns:w16cid="http://schemas.microsoft.com/office/word/2016/wordml/cid" xmlns:w16se="http://schemas.microsoft.com/office/word/2015/wordml/symex" xmlns:wpg="http://schemas.microsoft.com/office/word/2010/wordprocessingGroup" xmlns:wpi="http://schemas.microsoft.com/office/word/2010/wordprocessingInk" xmlns:wne="http://schemas.microsoft.com/office/word/2006/wordml" xmlns:wps="http://schemas.microsoft.com/office/word/2010/wordprocessingShape" mc:Ignorable="w14 w15 w16se w16cid wp14">
+<w:footnotes xmlns:wpc="http://schemas.microsoft.com/office/word/2010/wordprocessingCanvas" xmlns:cx="http://schemas.microsoft.com/office/drawing/2014/chartex" xmlns:cx1="http://schemas.microsoft.com/office/drawing/2015/9/8/chartex" xmlns:cx2="http://schemas.microsoft.com/office/drawing/2015/10/21/chartex" xmlns:cx3="http://schemas.microsoft.com/office/drawing/2016/5/9/chartex" xmlns:cx4="http://schemas.microsoft.com/office/drawing/2016/5/10/chartex" xmlns:cx5="http://schemas.microsoft.com/office/drawing/2016/5/11/chartex" xmlns:cx6="http://schemas.microsoft.com/office/drawing/2016/5/12/chartex" xmlns:cx7="http://schemas.microsoft.com/office/drawing/2016/5/13/chartex" xmlns:cx8="http://schemas.microsoft.com/office/drawing/2016/5/14/chartex" xmlns:mc="http://schemas.openxmlformats.org/markup-compatibility/2006" xmlns:aink="http://schemas.microsoft.com/office/drawing/2016/ink" xmlns:am3d="http://schemas.microsoft.com/office/drawing/2017/model3d" xmlns:o="urn:schemas-microsoft-com:office:office" xmlns:oel="http://schemas.microsoft.com/office/2019/extlst" xmlns:r="http://schemas.openxmlformats.org/officeDocument/2006/relationships" xmlns:m="http://schemas.openxmlformats.org/officeDocument/2006/math" xmlns:v="urn:schemas-microsoft-com:vml" xmlns:wp14="http://schemas.microsoft.com/office/word/2010/wordprocessingDrawing" xmlns:wp="http://schemas.openxmlformats.org/drawingml/2006/wordprocessingDrawing" xmlns:w10="urn:schemas-microsoft-com:office:word" xmlns:w="http://schemas.openxmlformats.org/wordprocessingml/2006/main" xmlns:w14="http://schemas.microsoft.com/office/word/2010/wordml" xmlns:w15="http://schemas.microsoft.com/office/word/2012/wordml" xmlns:w16cex="http://schemas.microsoft.com/office/word/2018/wordml/cex" xmlns:w16cid="http://schemas.microsoft.com/office/word/2016/wordml/cid" xmlns:w16="http://schemas.microsoft.com/office/word/2018/wordml" xmlns:w16du="http://schemas.microsoft.com/office/word/2023/wordml/word16du" xmlns:w16sdtdh="http://schemas.microsoft.com/office/word/2020/wordml/sdtdatahash" xmlns:w16sdtfl="http://schemas.microsoft.com/office/word/2024/wordml/sdtformatlock" xmlns:w16se="http://schemas.microsoft.com/office/word/2015/wordml/symex" xmlns:wpg="http://schemas.microsoft.com/office/word/2010/wordprocessingGroup" xmlns:wpi="http://schemas.microsoft.com/office/word/2010/wordprocessingInk" xmlns:wne="http://schemas.microsoft.com/office/word/2006/wordml" xmlns:wps="http://schemas.microsoft.com/office/word/2010/wordprocessingShape" mc:Ignorable="w14 w15 w16se w16cid w16 w16cex w16sdtdh w16sdtfl w16du wp14">
   <w:footnote w:type="separator" w:id="-1">
     <w:p>
       <w:pPr>
@@ -2182,8 +3504,1685 @@
 </w:footnotes>
 </file>
 
+<file path=word/numbering.xml><?xml version="1.0" encoding="utf-8"?>
+<w:numbering xmlns:wpc="http://schemas.microsoft.com/office/word/2010/wordprocessingCanvas" xmlns:cx="http://schemas.microsoft.com/office/drawing/2014/chartex" xmlns:cx1="http://schemas.microsoft.com/office/drawing/2015/9/8/chartex" xmlns:cx2="http://schemas.microsoft.com/office/drawing/2015/10/21/chartex" xmlns:cx3="http://schemas.microsoft.com/office/drawing/2016/5/9/chartex" xmlns:cx4="http://schemas.microsoft.com/office/drawing/2016/5/10/chartex" xmlns:cx5="http://schemas.microsoft.com/office/drawing/2016/5/11/chartex" xmlns:cx6="http://schemas.microsoft.com/office/drawing/2016/5/12/chartex" xmlns:cx7="http://schemas.microsoft.com/office/drawing/2016/5/13/chartex" xmlns:cx8="http://schemas.microsoft.com/office/drawing/2016/5/14/chartex" xmlns:mc="http://schemas.openxmlformats.org/markup-compatibility/2006" xmlns:aink="http://schemas.microsoft.com/office/drawing/2016/ink" xmlns:am3d="http://schemas.microsoft.com/office/drawing/2017/model3d" xmlns:o="urn:schemas-microsoft-com:office:office" xmlns:oel="http://schemas.microsoft.com/office/2019/extlst" xmlns:r="http://schemas.openxmlformats.org/officeDocument/2006/relationships" xmlns:m="http://schemas.openxmlformats.org/officeDocument/2006/math" xmlns:v="urn:schemas-microsoft-com:vml" xmlns:wp14="http://schemas.microsoft.com/office/word/2010/wordprocessingDrawing" xmlns:wp="http://schemas.openxmlformats.org/drawingml/2006/wordprocessingDrawing" xmlns:w10="urn:schemas-microsoft-com:office:word" xmlns:w="http://schemas.openxmlformats.org/wordprocessingml/2006/main" xmlns:w14="http://schemas.microsoft.com/office/word/2010/wordml" xmlns:w15="http://schemas.microsoft.com/office/word/2012/wordml" xmlns:w16cex="http://schemas.microsoft.com/office/word/2018/wordml/cex" xmlns:w16cid="http://schemas.microsoft.com/office/word/2016/wordml/cid" xmlns:w16="http://schemas.microsoft.com/office/word/2018/wordml" xmlns:w16du="http://schemas.microsoft.com/office/word/2023/wordml/word16du" xmlns:w16sdtdh="http://schemas.microsoft.com/office/word/2020/wordml/sdtdatahash" xmlns:w16sdtfl="http://schemas.microsoft.com/office/word/2024/wordml/sdtformatlock" xmlns:w16se="http://schemas.microsoft.com/office/word/2015/wordml/symex" xmlns:wpg="http://schemas.microsoft.com/office/word/2010/wordprocessingGroup" xmlns:wpi="http://schemas.microsoft.com/office/word/2010/wordprocessingInk" xmlns:wne="http://schemas.microsoft.com/office/word/2006/wordml" xmlns:wps="http://schemas.microsoft.com/office/word/2010/wordprocessingShape" mc:Ignorable="w14 w15 w16se w16cid w16 w16cex w16sdtdh w16sdtfl w16du wp14">
+  <w:abstractNum w:abstractNumId="0" w15:restartNumberingAfterBreak="0">
+    <w:nsid w:val="072C5FA4"/>
+    <w:multiLevelType w:val="multilevel"/>
+    <w:tmpl w:val="D7E2B592"/>
+    <w:lvl w:ilvl="0">
+      <w:start w:val="1"/>
+      <w:numFmt w:val="bullet"/>
+      <w:lvlText w:val=""/>
+      <w:lvlJc w:val="left"/>
+      <w:pPr>
+        <w:tabs>
+          <w:tab w:val="num" w:pos="720"/>
+        </w:tabs>
+        <w:ind w:left="720" w:hanging="360"/>
+      </w:pPr>
+      <w:rPr>
+        <w:rFonts w:ascii="Symbol" w:hAnsi="Symbol" w:hint="default"/>
+        <w:sz w:val="20"/>
+      </w:rPr>
+    </w:lvl>
+    <w:lvl w:ilvl="1" w:tentative="1">
+      <w:start w:val="1"/>
+      <w:numFmt w:val="bullet"/>
+      <w:lvlText w:val="o"/>
+      <w:lvlJc w:val="left"/>
+      <w:pPr>
+        <w:tabs>
+          <w:tab w:val="num" w:pos="1440"/>
+        </w:tabs>
+        <w:ind w:left="1440" w:hanging="360"/>
+      </w:pPr>
+      <w:rPr>
+        <w:rFonts w:ascii="Courier New" w:hAnsi="Courier New" w:hint="default"/>
+        <w:sz w:val="20"/>
+      </w:rPr>
+    </w:lvl>
+    <w:lvl w:ilvl="2" w:tentative="1">
+      <w:start w:val="1"/>
+      <w:numFmt w:val="bullet"/>
+      <w:lvlText w:val=""/>
+      <w:lvlJc w:val="left"/>
+      <w:pPr>
+        <w:tabs>
+          <w:tab w:val="num" w:pos="2160"/>
+        </w:tabs>
+        <w:ind w:left="2160" w:hanging="360"/>
+      </w:pPr>
+      <w:rPr>
+        <w:rFonts w:ascii="Wingdings" w:hAnsi="Wingdings" w:hint="default"/>
+        <w:sz w:val="20"/>
+      </w:rPr>
+    </w:lvl>
+    <w:lvl w:ilvl="3" w:tentative="1">
+      <w:start w:val="1"/>
+      <w:numFmt w:val="bullet"/>
+      <w:lvlText w:val=""/>
+      <w:lvlJc w:val="left"/>
+      <w:pPr>
+        <w:tabs>
+          <w:tab w:val="num" w:pos="2880"/>
+        </w:tabs>
+        <w:ind w:left="2880" w:hanging="360"/>
+      </w:pPr>
+      <w:rPr>
+        <w:rFonts w:ascii="Wingdings" w:hAnsi="Wingdings" w:hint="default"/>
+        <w:sz w:val="20"/>
+      </w:rPr>
+    </w:lvl>
+    <w:lvl w:ilvl="4" w:tentative="1">
+      <w:start w:val="1"/>
+      <w:numFmt w:val="bullet"/>
+      <w:lvlText w:val=""/>
+      <w:lvlJc w:val="left"/>
+      <w:pPr>
+        <w:tabs>
+          <w:tab w:val="num" w:pos="3600"/>
+        </w:tabs>
+        <w:ind w:left="3600" w:hanging="360"/>
+      </w:pPr>
+      <w:rPr>
+        <w:rFonts w:ascii="Wingdings" w:hAnsi="Wingdings" w:hint="default"/>
+        <w:sz w:val="20"/>
+      </w:rPr>
+    </w:lvl>
+    <w:lvl w:ilvl="5" w:tentative="1">
+      <w:start w:val="1"/>
+      <w:numFmt w:val="bullet"/>
+      <w:lvlText w:val=""/>
+      <w:lvlJc w:val="left"/>
+      <w:pPr>
+        <w:tabs>
+          <w:tab w:val="num" w:pos="4320"/>
+        </w:tabs>
+        <w:ind w:left="4320" w:hanging="360"/>
+      </w:pPr>
+      <w:rPr>
+        <w:rFonts w:ascii="Wingdings" w:hAnsi="Wingdings" w:hint="default"/>
+        <w:sz w:val="20"/>
+      </w:rPr>
+    </w:lvl>
+    <w:lvl w:ilvl="6" w:tentative="1">
+      <w:start w:val="1"/>
+      <w:numFmt w:val="bullet"/>
+      <w:lvlText w:val=""/>
+      <w:lvlJc w:val="left"/>
+      <w:pPr>
+        <w:tabs>
+          <w:tab w:val="num" w:pos="5040"/>
+        </w:tabs>
+        <w:ind w:left="5040" w:hanging="360"/>
+      </w:pPr>
+      <w:rPr>
+        <w:rFonts w:ascii="Wingdings" w:hAnsi="Wingdings" w:hint="default"/>
+        <w:sz w:val="20"/>
+      </w:rPr>
+    </w:lvl>
+    <w:lvl w:ilvl="7" w:tentative="1">
+      <w:start w:val="1"/>
+      <w:numFmt w:val="bullet"/>
+      <w:lvlText w:val=""/>
+      <w:lvlJc w:val="left"/>
+      <w:pPr>
+        <w:tabs>
+          <w:tab w:val="num" w:pos="5760"/>
+        </w:tabs>
+        <w:ind w:left="5760" w:hanging="360"/>
+      </w:pPr>
+      <w:rPr>
+        <w:rFonts w:ascii="Wingdings" w:hAnsi="Wingdings" w:hint="default"/>
+        <w:sz w:val="20"/>
+      </w:rPr>
+    </w:lvl>
+    <w:lvl w:ilvl="8" w:tentative="1">
+      <w:start w:val="1"/>
+      <w:numFmt w:val="bullet"/>
+      <w:lvlText w:val=""/>
+      <w:lvlJc w:val="left"/>
+      <w:pPr>
+        <w:tabs>
+          <w:tab w:val="num" w:pos="6480"/>
+        </w:tabs>
+        <w:ind w:left="6480" w:hanging="360"/>
+      </w:pPr>
+      <w:rPr>
+        <w:rFonts w:ascii="Wingdings" w:hAnsi="Wingdings" w:hint="default"/>
+        <w:sz w:val="20"/>
+      </w:rPr>
+    </w:lvl>
+  </w:abstractNum>
+  <w:abstractNum w:abstractNumId="1" w15:restartNumberingAfterBreak="0">
+    <w:nsid w:val="07C07F2F"/>
+    <w:multiLevelType w:val="multilevel"/>
+    <w:tmpl w:val="FCD6432E"/>
+    <w:lvl w:ilvl="0">
+      <w:start w:val="1"/>
+      <w:numFmt w:val="bullet"/>
+      <w:lvlText w:val=""/>
+      <w:lvlJc w:val="left"/>
+      <w:pPr>
+        <w:tabs>
+          <w:tab w:val="num" w:pos="720"/>
+        </w:tabs>
+        <w:ind w:left="720" w:hanging="360"/>
+      </w:pPr>
+      <w:rPr>
+        <w:rFonts w:ascii="Symbol" w:hAnsi="Symbol" w:hint="default"/>
+        <w:sz w:val="20"/>
+      </w:rPr>
+    </w:lvl>
+    <w:lvl w:ilvl="1" w:tentative="1">
+      <w:start w:val="1"/>
+      <w:numFmt w:val="bullet"/>
+      <w:lvlText w:val="o"/>
+      <w:lvlJc w:val="left"/>
+      <w:pPr>
+        <w:tabs>
+          <w:tab w:val="num" w:pos="1440"/>
+        </w:tabs>
+        <w:ind w:left="1440" w:hanging="360"/>
+      </w:pPr>
+      <w:rPr>
+        <w:rFonts w:ascii="Courier New" w:hAnsi="Courier New" w:hint="default"/>
+        <w:sz w:val="20"/>
+      </w:rPr>
+    </w:lvl>
+    <w:lvl w:ilvl="2" w:tentative="1">
+      <w:start w:val="1"/>
+      <w:numFmt w:val="bullet"/>
+      <w:lvlText w:val=""/>
+      <w:lvlJc w:val="left"/>
+      <w:pPr>
+        <w:tabs>
+          <w:tab w:val="num" w:pos="2160"/>
+        </w:tabs>
+        <w:ind w:left="2160" w:hanging="360"/>
+      </w:pPr>
+      <w:rPr>
+        <w:rFonts w:ascii="Wingdings" w:hAnsi="Wingdings" w:hint="default"/>
+        <w:sz w:val="20"/>
+      </w:rPr>
+    </w:lvl>
+    <w:lvl w:ilvl="3" w:tentative="1">
+      <w:start w:val="1"/>
+      <w:numFmt w:val="bullet"/>
+      <w:lvlText w:val=""/>
+      <w:lvlJc w:val="left"/>
+      <w:pPr>
+        <w:tabs>
+          <w:tab w:val="num" w:pos="2880"/>
+        </w:tabs>
+        <w:ind w:left="2880" w:hanging="360"/>
+      </w:pPr>
+      <w:rPr>
+        <w:rFonts w:ascii="Wingdings" w:hAnsi="Wingdings" w:hint="default"/>
+        <w:sz w:val="20"/>
+      </w:rPr>
+    </w:lvl>
+    <w:lvl w:ilvl="4" w:tentative="1">
+      <w:start w:val="1"/>
+      <w:numFmt w:val="bullet"/>
+      <w:lvlText w:val=""/>
+      <w:lvlJc w:val="left"/>
+      <w:pPr>
+        <w:tabs>
+          <w:tab w:val="num" w:pos="3600"/>
+        </w:tabs>
+        <w:ind w:left="3600" w:hanging="360"/>
+      </w:pPr>
+      <w:rPr>
+        <w:rFonts w:ascii="Wingdings" w:hAnsi="Wingdings" w:hint="default"/>
+        <w:sz w:val="20"/>
+      </w:rPr>
+    </w:lvl>
+    <w:lvl w:ilvl="5" w:tentative="1">
+      <w:start w:val="1"/>
+      <w:numFmt w:val="bullet"/>
+      <w:lvlText w:val=""/>
+      <w:lvlJc w:val="left"/>
+      <w:pPr>
+        <w:tabs>
+          <w:tab w:val="num" w:pos="4320"/>
+        </w:tabs>
+        <w:ind w:left="4320" w:hanging="360"/>
+      </w:pPr>
+      <w:rPr>
+        <w:rFonts w:ascii="Wingdings" w:hAnsi="Wingdings" w:hint="default"/>
+        <w:sz w:val="20"/>
+      </w:rPr>
+    </w:lvl>
+    <w:lvl w:ilvl="6" w:tentative="1">
+      <w:start w:val="1"/>
+      <w:numFmt w:val="bullet"/>
+      <w:lvlText w:val=""/>
+      <w:lvlJc w:val="left"/>
+      <w:pPr>
+        <w:tabs>
+          <w:tab w:val="num" w:pos="5040"/>
+        </w:tabs>
+        <w:ind w:left="5040" w:hanging="360"/>
+      </w:pPr>
+      <w:rPr>
+        <w:rFonts w:ascii="Wingdings" w:hAnsi="Wingdings" w:hint="default"/>
+        <w:sz w:val="20"/>
+      </w:rPr>
+    </w:lvl>
+    <w:lvl w:ilvl="7" w:tentative="1">
+      <w:start w:val="1"/>
+      <w:numFmt w:val="bullet"/>
+      <w:lvlText w:val=""/>
+      <w:lvlJc w:val="left"/>
+      <w:pPr>
+        <w:tabs>
+          <w:tab w:val="num" w:pos="5760"/>
+        </w:tabs>
+        <w:ind w:left="5760" w:hanging="360"/>
+      </w:pPr>
+      <w:rPr>
+        <w:rFonts w:ascii="Wingdings" w:hAnsi="Wingdings" w:hint="default"/>
+        <w:sz w:val="20"/>
+      </w:rPr>
+    </w:lvl>
+    <w:lvl w:ilvl="8" w:tentative="1">
+      <w:start w:val="1"/>
+      <w:numFmt w:val="bullet"/>
+      <w:lvlText w:val=""/>
+      <w:lvlJc w:val="left"/>
+      <w:pPr>
+        <w:tabs>
+          <w:tab w:val="num" w:pos="6480"/>
+        </w:tabs>
+        <w:ind w:left="6480" w:hanging="360"/>
+      </w:pPr>
+      <w:rPr>
+        <w:rFonts w:ascii="Wingdings" w:hAnsi="Wingdings" w:hint="default"/>
+        <w:sz w:val="20"/>
+      </w:rPr>
+    </w:lvl>
+  </w:abstractNum>
+  <w:abstractNum w:abstractNumId="2" w15:restartNumberingAfterBreak="0">
+    <w:nsid w:val="0D5240B4"/>
+    <w:multiLevelType w:val="multilevel"/>
+    <w:tmpl w:val="F2CADDB2"/>
+    <w:lvl w:ilvl="0">
+      <w:start w:val="1"/>
+      <w:numFmt w:val="bullet"/>
+      <w:lvlText w:val=""/>
+      <w:lvlJc w:val="left"/>
+      <w:pPr>
+        <w:tabs>
+          <w:tab w:val="num" w:pos="720"/>
+        </w:tabs>
+        <w:ind w:left="720" w:hanging="360"/>
+      </w:pPr>
+      <w:rPr>
+        <w:rFonts w:ascii="Symbol" w:hAnsi="Symbol" w:hint="default"/>
+        <w:sz w:val="20"/>
+      </w:rPr>
+    </w:lvl>
+    <w:lvl w:ilvl="1" w:tentative="1">
+      <w:start w:val="1"/>
+      <w:numFmt w:val="bullet"/>
+      <w:lvlText w:val="o"/>
+      <w:lvlJc w:val="left"/>
+      <w:pPr>
+        <w:tabs>
+          <w:tab w:val="num" w:pos="1440"/>
+        </w:tabs>
+        <w:ind w:left="1440" w:hanging="360"/>
+      </w:pPr>
+      <w:rPr>
+        <w:rFonts w:ascii="Courier New" w:hAnsi="Courier New" w:hint="default"/>
+        <w:sz w:val="20"/>
+      </w:rPr>
+    </w:lvl>
+    <w:lvl w:ilvl="2" w:tentative="1">
+      <w:start w:val="1"/>
+      <w:numFmt w:val="bullet"/>
+      <w:lvlText w:val=""/>
+      <w:lvlJc w:val="left"/>
+      <w:pPr>
+        <w:tabs>
+          <w:tab w:val="num" w:pos="2160"/>
+        </w:tabs>
+        <w:ind w:left="2160" w:hanging="360"/>
+      </w:pPr>
+      <w:rPr>
+        <w:rFonts w:ascii="Wingdings" w:hAnsi="Wingdings" w:hint="default"/>
+        <w:sz w:val="20"/>
+      </w:rPr>
+    </w:lvl>
+    <w:lvl w:ilvl="3" w:tentative="1">
+      <w:start w:val="1"/>
+      <w:numFmt w:val="bullet"/>
+      <w:lvlText w:val=""/>
+      <w:lvlJc w:val="left"/>
+      <w:pPr>
+        <w:tabs>
+          <w:tab w:val="num" w:pos="2880"/>
+        </w:tabs>
+        <w:ind w:left="2880" w:hanging="360"/>
+      </w:pPr>
+      <w:rPr>
+        <w:rFonts w:ascii="Wingdings" w:hAnsi="Wingdings" w:hint="default"/>
+        <w:sz w:val="20"/>
+      </w:rPr>
+    </w:lvl>
+    <w:lvl w:ilvl="4" w:tentative="1">
+      <w:start w:val="1"/>
+      <w:numFmt w:val="bullet"/>
+      <w:lvlText w:val=""/>
+      <w:lvlJc w:val="left"/>
+      <w:pPr>
+        <w:tabs>
+          <w:tab w:val="num" w:pos="3600"/>
+        </w:tabs>
+        <w:ind w:left="3600" w:hanging="360"/>
+      </w:pPr>
+      <w:rPr>
+        <w:rFonts w:ascii="Wingdings" w:hAnsi="Wingdings" w:hint="default"/>
+        <w:sz w:val="20"/>
+      </w:rPr>
+    </w:lvl>
+    <w:lvl w:ilvl="5" w:tentative="1">
+      <w:start w:val="1"/>
+      <w:numFmt w:val="bullet"/>
+      <w:lvlText w:val=""/>
+      <w:lvlJc w:val="left"/>
+      <w:pPr>
+        <w:tabs>
+          <w:tab w:val="num" w:pos="4320"/>
+        </w:tabs>
+        <w:ind w:left="4320" w:hanging="360"/>
+      </w:pPr>
+      <w:rPr>
+        <w:rFonts w:ascii="Wingdings" w:hAnsi="Wingdings" w:hint="default"/>
+        <w:sz w:val="20"/>
+      </w:rPr>
+    </w:lvl>
+    <w:lvl w:ilvl="6" w:tentative="1">
+      <w:start w:val="1"/>
+      <w:numFmt w:val="bullet"/>
+      <w:lvlText w:val=""/>
+      <w:lvlJc w:val="left"/>
+      <w:pPr>
+        <w:tabs>
+          <w:tab w:val="num" w:pos="5040"/>
+        </w:tabs>
+        <w:ind w:left="5040" w:hanging="360"/>
+      </w:pPr>
+      <w:rPr>
+        <w:rFonts w:ascii="Wingdings" w:hAnsi="Wingdings" w:hint="default"/>
+        <w:sz w:val="20"/>
+      </w:rPr>
+    </w:lvl>
+    <w:lvl w:ilvl="7" w:tentative="1">
+      <w:start w:val="1"/>
+      <w:numFmt w:val="bullet"/>
+      <w:lvlText w:val=""/>
+      <w:lvlJc w:val="left"/>
+      <w:pPr>
+        <w:tabs>
+          <w:tab w:val="num" w:pos="5760"/>
+        </w:tabs>
+        <w:ind w:left="5760" w:hanging="360"/>
+      </w:pPr>
+      <w:rPr>
+        <w:rFonts w:ascii="Wingdings" w:hAnsi="Wingdings" w:hint="default"/>
+        <w:sz w:val="20"/>
+      </w:rPr>
+    </w:lvl>
+    <w:lvl w:ilvl="8" w:tentative="1">
+      <w:start w:val="1"/>
+      <w:numFmt w:val="bullet"/>
+      <w:lvlText w:val=""/>
+      <w:lvlJc w:val="left"/>
+      <w:pPr>
+        <w:tabs>
+          <w:tab w:val="num" w:pos="6480"/>
+        </w:tabs>
+        <w:ind w:left="6480" w:hanging="360"/>
+      </w:pPr>
+      <w:rPr>
+        <w:rFonts w:ascii="Wingdings" w:hAnsi="Wingdings" w:hint="default"/>
+        <w:sz w:val="20"/>
+      </w:rPr>
+    </w:lvl>
+  </w:abstractNum>
+  <w:abstractNum w:abstractNumId="3" w15:restartNumberingAfterBreak="0">
+    <w:nsid w:val="16B43471"/>
+    <w:multiLevelType w:val="multilevel"/>
+    <w:tmpl w:val="1A7445A4"/>
+    <w:lvl w:ilvl="0">
+      <w:start w:val="1"/>
+      <w:numFmt w:val="bullet"/>
+      <w:lvlText w:val=""/>
+      <w:lvlJc w:val="left"/>
+      <w:pPr>
+        <w:tabs>
+          <w:tab w:val="num" w:pos="720"/>
+        </w:tabs>
+        <w:ind w:left="720" w:hanging="360"/>
+      </w:pPr>
+      <w:rPr>
+        <w:rFonts w:ascii="Symbol" w:hAnsi="Symbol" w:hint="default"/>
+        <w:sz w:val="20"/>
+      </w:rPr>
+    </w:lvl>
+    <w:lvl w:ilvl="1" w:tentative="1">
+      <w:start w:val="1"/>
+      <w:numFmt w:val="bullet"/>
+      <w:lvlText w:val="o"/>
+      <w:lvlJc w:val="left"/>
+      <w:pPr>
+        <w:tabs>
+          <w:tab w:val="num" w:pos="1440"/>
+        </w:tabs>
+        <w:ind w:left="1440" w:hanging="360"/>
+      </w:pPr>
+      <w:rPr>
+        <w:rFonts w:ascii="Courier New" w:hAnsi="Courier New" w:hint="default"/>
+        <w:sz w:val="20"/>
+      </w:rPr>
+    </w:lvl>
+    <w:lvl w:ilvl="2" w:tentative="1">
+      <w:start w:val="1"/>
+      <w:numFmt w:val="bullet"/>
+      <w:lvlText w:val=""/>
+      <w:lvlJc w:val="left"/>
+      <w:pPr>
+        <w:tabs>
+          <w:tab w:val="num" w:pos="2160"/>
+        </w:tabs>
+        <w:ind w:left="2160" w:hanging="360"/>
+      </w:pPr>
+      <w:rPr>
+        <w:rFonts w:ascii="Wingdings" w:hAnsi="Wingdings" w:hint="default"/>
+        <w:sz w:val="20"/>
+      </w:rPr>
+    </w:lvl>
+    <w:lvl w:ilvl="3" w:tentative="1">
+      <w:start w:val="1"/>
+      <w:numFmt w:val="bullet"/>
+      <w:lvlText w:val=""/>
+      <w:lvlJc w:val="left"/>
+      <w:pPr>
+        <w:tabs>
+          <w:tab w:val="num" w:pos="2880"/>
+        </w:tabs>
+        <w:ind w:left="2880" w:hanging="360"/>
+      </w:pPr>
+      <w:rPr>
+        <w:rFonts w:ascii="Wingdings" w:hAnsi="Wingdings" w:hint="default"/>
+        <w:sz w:val="20"/>
+      </w:rPr>
+    </w:lvl>
+    <w:lvl w:ilvl="4" w:tentative="1">
+      <w:start w:val="1"/>
+      <w:numFmt w:val="bullet"/>
+      <w:lvlText w:val=""/>
+      <w:lvlJc w:val="left"/>
+      <w:pPr>
+        <w:tabs>
+          <w:tab w:val="num" w:pos="3600"/>
+        </w:tabs>
+        <w:ind w:left="3600" w:hanging="360"/>
+      </w:pPr>
+      <w:rPr>
+        <w:rFonts w:ascii="Wingdings" w:hAnsi="Wingdings" w:hint="default"/>
+        <w:sz w:val="20"/>
+      </w:rPr>
+    </w:lvl>
+    <w:lvl w:ilvl="5" w:tentative="1">
+      <w:start w:val="1"/>
+      <w:numFmt w:val="bullet"/>
+      <w:lvlText w:val=""/>
+      <w:lvlJc w:val="left"/>
+      <w:pPr>
+        <w:tabs>
+          <w:tab w:val="num" w:pos="4320"/>
+        </w:tabs>
+        <w:ind w:left="4320" w:hanging="360"/>
+      </w:pPr>
+      <w:rPr>
+        <w:rFonts w:ascii="Wingdings" w:hAnsi="Wingdings" w:hint="default"/>
+        <w:sz w:val="20"/>
+      </w:rPr>
+    </w:lvl>
+    <w:lvl w:ilvl="6" w:tentative="1">
+      <w:start w:val="1"/>
+      <w:numFmt w:val="bullet"/>
+      <w:lvlText w:val=""/>
+      <w:lvlJc w:val="left"/>
+      <w:pPr>
+        <w:tabs>
+          <w:tab w:val="num" w:pos="5040"/>
+        </w:tabs>
+        <w:ind w:left="5040" w:hanging="360"/>
+      </w:pPr>
+      <w:rPr>
+        <w:rFonts w:ascii="Wingdings" w:hAnsi="Wingdings" w:hint="default"/>
+        <w:sz w:val="20"/>
+      </w:rPr>
+    </w:lvl>
+    <w:lvl w:ilvl="7" w:tentative="1">
+      <w:start w:val="1"/>
+      <w:numFmt w:val="bullet"/>
+      <w:lvlText w:val=""/>
+      <w:lvlJc w:val="left"/>
+      <w:pPr>
+        <w:tabs>
+          <w:tab w:val="num" w:pos="5760"/>
+        </w:tabs>
+        <w:ind w:left="5760" w:hanging="360"/>
+      </w:pPr>
+      <w:rPr>
+        <w:rFonts w:ascii="Wingdings" w:hAnsi="Wingdings" w:hint="default"/>
+        <w:sz w:val="20"/>
+      </w:rPr>
+    </w:lvl>
+    <w:lvl w:ilvl="8" w:tentative="1">
+      <w:start w:val="1"/>
+      <w:numFmt w:val="bullet"/>
+      <w:lvlText w:val=""/>
+      <w:lvlJc w:val="left"/>
+      <w:pPr>
+        <w:tabs>
+          <w:tab w:val="num" w:pos="6480"/>
+        </w:tabs>
+        <w:ind w:left="6480" w:hanging="360"/>
+      </w:pPr>
+      <w:rPr>
+        <w:rFonts w:ascii="Wingdings" w:hAnsi="Wingdings" w:hint="default"/>
+        <w:sz w:val="20"/>
+      </w:rPr>
+    </w:lvl>
+  </w:abstractNum>
+  <w:abstractNum w:abstractNumId="4" w15:restartNumberingAfterBreak="0">
+    <w:nsid w:val="1DDB211B"/>
+    <w:multiLevelType w:val="multilevel"/>
+    <w:tmpl w:val="8110BB44"/>
+    <w:lvl w:ilvl="0">
+      <w:start w:val="1"/>
+      <w:numFmt w:val="bullet"/>
+      <w:lvlText w:val=""/>
+      <w:lvlJc w:val="left"/>
+      <w:pPr>
+        <w:tabs>
+          <w:tab w:val="num" w:pos="720"/>
+        </w:tabs>
+        <w:ind w:left="720" w:hanging="360"/>
+      </w:pPr>
+      <w:rPr>
+        <w:rFonts w:ascii="Symbol" w:hAnsi="Symbol" w:hint="default"/>
+        <w:sz w:val="20"/>
+      </w:rPr>
+    </w:lvl>
+    <w:lvl w:ilvl="1" w:tentative="1">
+      <w:start w:val="1"/>
+      <w:numFmt w:val="bullet"/>
+      <w:lvlText w:val="o"/>
+      <w:lvlJc w:val="left"/>
+      <w:pPr>
+        <w:tabs>
+          <w:tab w:val="num" w:pos="1440"/>
+        </w:tabs>
+        <w:ind w:left="1440" w:hanging="360"/>
+      </w:pPr>
+      <w:rPr>
+        <w:rFonts w:ascii="Courier New" w:hAnsi="Courier New" w:hint="default"/>
+        <w:sz w:val="20"/>
+      </w:rPr>
+    </w:lvl>
+    <w:lvl w:ilvl="2" w:tentative="1">
+      <w:start w:val="1"/>
+      <w:numFmt w:val="bullet"/>
+      <w:lvlText w:val=""/>
+      <w:lvlJc w:val="left"/>
+      <w:pPr>
+        <w:tabs>
+          <w:tab w:val="num" w:pos="2160"/>
+        </w:tabs>
+        <w:ind w:left="2160" w:hanging="360"/>
+      </w:pPr>
+      <w:rPr>
+        <w:rFonts w:ascii="Wingdings" w:hAnsi="Wingdings" w:hint="default"/>
+        <w:sz w:val="20"/>
+      </w:rPr>
+    </w:lvl>
+    <w:lvl w:ilvl="3" w:tentative="1">
+      <w:start w:val="1"/>
+      <w:numFmt w:val="bullet"/>
+      <w:lvlText w:val=""/>
+      <w:lvlJc w:val="left"/>
+      <w:pPr>
+        <w:tabs>
+          <w:tab w:val="num" w:pos="2880"/>
+        </w:tabs>
+        <w:ind w:left="2880" w:hanging="360"/>
+      </w:pPr>
+      <w:rPr>
+        <w:rFonts w:ascii="Wingdings" w:hAnsi="Wingdings" w:hint="default"/>
+        <w:sz w:val="20"/>
+      </w:rPr>
+    </w:lvl>
+    <w:lvl w:ilvl="4" w:tentative="1">
+      <w:start w:val="1"/>
+      <w:numFmt w:val="bullet"/>
+      <w:lvlText w:val=""/>
+      <w:lvlJc w:val="left"/>
+      <w:pPr>
+        <w:tabs>
+          <w:tab w:val="num" w:pos="3600"/>
+        </w:tabs>
+        <w:ind w:left="3600" w:hanging="360"/>
+      </w:pPr>
+      <w:rPr>
+        <w:rFonts w:ascii="Wingdings" w:hAnsi="Wingdings" w:hint="default"/>
+        <w:sz w:val="20"/>
+      </w:rPr>
+    </w:lvl>
+    <w:lvl w:ilvl="5" w:tentative="1">
+      <w:start w:val="1"/>
+      <w:numFmt w:val="bullet"/>
+      <w:lvlText w:val=""/>
+      <w:lvlJc w:val="left"/>
+      <w:pPr>
+        <w:tabs>
+          <w:tab w:val="num" w:pos="4320"/>
+        </w:tabs>
+        <w:ind w:left="4320" w:hanging="360"/>
+      </w:pPr>
+      <w:rPr>
+        <w:rFonts w:ascii="Wingdings" w:hAnsi="Wingdings" w:hint="default"/>
+        <w:sz w:val="20"/>
+      </w:rPr>
+    </w:lvl>
+    <w:lvl w:ilvl="6" w:tentative="1">
+      <w:start w:val="1"/>
+      <w:numFmt w:val="bullet"/>
+      <w:lvlText w:val=""/>
+      <w:lvlJc w:val="left"/>
+      <w:pPr>
+        <w:tabs>
+          <w:tab w:val="num" w:pos="5040"/>
+        </w:tabs>
+        <w:ind w:left="5040" w:hanging="360"/>
+      </w:pPr>
+      <w:rPr>
+        <w:rFonts w:ascii="Wingdings" w:hAnsi="Wingdings" w:hint="default"/>
+        <w:sz w:val="20"/>
+      </w:rPr>
+    </w:lvl>
+    <w:lvl w:ilvl="7" w:tentative="1">
+      <w:start w:val="1"/>
+      <w:numFmt w:val="bullet"/>
+      <w:lvlText w:val=""/>
+      <w:lvlJc w:val="left"/>
+      <w:pPr>
+        <w:tabs>
+          <w:tab w:val="num" w:pos="5760"/>
+        </w:tabs>
+        <w:ind w:left="5760" w:hanging="360"/>
+      </w:pPr>
+      <w:rPr>
+        <w:rFonts w:ascii="Wingdings" w:hAnsi="Wingdings" w:hint="default"/>
+        <w:sz w:val="20"/>
+      </w:rPr>
+    </w:lvl>
+    <w:lvl w:ilvl="8" w:tentative="1">
+      <w:start w:val="1"/>
+      <w:numFmt w:val="bullet"/>
+      <w:lvlText w:val=""/>
+      <w:lvlJc w:val="left"/>
+      <w:pPr>
+        <w:tabs>
+          <w:tab w:val="num" w:pos="6480"/>
+        </w:tabs>
+        <w:ind w:left="6480" w:hanging="360"/>
+      </w:pPr>
+      <w:rPr>
+        <w:rFonts w:ascii="Wingdings" w:hAnsi="Wingdings" w:hint="default"/>
+        <w:sz w:val="20"/>
+      </w:rPr>
+    </w:lvl>
+  </w:abstractNum>
+  <w:abstractNum w:abstractNumId="5" w15:restartNumberingAfterBreak="0">
+    <w:nsid w:val="1F2C1421"/>
+    <w:multiLevelType w:val="multilevel"/>
+    <w:tmpl w:val="E9EC9342"/>
+    <w:lvl w:ilvl="0">
+      <w:start w:val="1"/>
+      <w:numFmt w:val="bullet"/>
+      <w:lvlText w:val=""/>
+      <w:lvlJc w:val="left"/>
+      <w:pPr>
+        <w:tabs>
+          <w:tab w:val="num" w:pos="720"/>
+        </w:tabs>
+        <w:ind w:left="720" w:hanging="360"/>
+      </w:pPr>
+      <w:rPr>
+        <w:rFonts w:ascii="Symbol" w:hAnsi="Symbol" w:hint="default"/>
+        <w:sz w:val="20"/>
+      </w:rPr>
+    </w:lvl>
+    <w:lvl w:ilvl="1" w:tentative="1">
+      <w:start w:val="1"/>
+      <w:numFmt w:val="bullet"/>
+      <w:lvlText w:val="o"/>
+      <w:lvlJc w:val="left"/>
+      <w:pPr>
+        <w:tabs>
+          <w:tab w:val="num" w:pos="1440"/>
+        </w:tabs>
+        <w:ind w:left="1440" w:hanging="360"/>
+      </w:pPr>
+      <w:rPr>
+        <w:rFonts w:ascii="Courier New" w:hAnsi="Courier New" w:hint="default"/>
+        <w:sz w:val="20"/>
+      </w:rPr>
+    </w:lvl>
+    <w:lvl w:ilvl="2" w:tentative="1">
+      <w:start w:val="1"/>
+      <w:numFmt w:val="bullet"/>
+      <w:lvlText w:val=""/>
+      <w:lvlJc w:val="left"/>
+      <w:pPr>
+        <w:tabs>
+          <w:tab w:val="num" w:pos="2160"/>
+        </w:tabs>
+        <w:ind w:left="2160" w:hanging="360"/>
+      </w:pPr>
+      <w:rPr>
+        <w:rFonts w:ascii="Wingdings" w:hAnsi="Wingdings" w:hint="default"/>
+        <w:sz w:val="20"/>
+      </w:rPr>
+    </w:lvl>
+    <w:lvl w:ilvl="3" w:tentative="1">
+      <w:start w:val="1"/>
+      <w:numFmt w:val="bullet"/>
+      <w:lvlText w:val=""/>
+      <w:lvlJc w:val="left"/>
+      <w:pPr>
+        <w:tabs>
+          <w:tab w:val="num" w:pos="2880"/>
+        </w:tabs>
+        <w:ind w:left="2880" w:hanging="360"/>
+      </w:pPr>
+      <w:rPr>
+        <w:rFonts w:ascii="Wingdings" w:hAnsi="Wingdings" w:hint="default"/>
+        <w:sz w:val="20"/>
+      </w:rPr>
+    </w:lvl>
+    <w:lvl w:ilvl="4" w:tentative="1">
+      <w:start w:val="1"/>
+      <w:numFmt w:val="bullet"/>
+      <w:lvlText w:val=""/>
+      <w:lvlJc w:val="left"/>
+      <w:pPr>
+        <w:tabs>
+          <w:tab w:val="num" w:pos="3600"/>
+        </w:tabs>
+        <w:ind w:left="3600" w:hanging="360"/>
+      </w:pPr>
+      <w:rPr>
+        <w:rFonts w:ascii="Wingdings" w:hAnsi="Wingdings" w:hint="default"/>
+        <w:sz w:val="20"/>
+      </w:rPr>
+    </w:lvl>
+    <w:lvl w:ilvl="5" w:tentative="1">
+      <w:start w:val="1"/>
+      <w:numFmt w:val="bullet"/>
+      <w:lvlText w:val=""/>
+      <w:lvlJc w:val="left"/>
+      <w:pPr>
+        <w:tabs>
+          <w:tab w:val="num" w:pos="4320"/>
+        </w:tabs>
+        <w:ind w:left="4320" w:hanging="360"/>
+      </w:pPr>
+      <w:rPr>
+        <w:rFonts w:ascii="Wingdings" w:hAnsi="Wingdings" w:hint="default"/>
+        <w:sz w:val="20"/>
+      </w:rPr>
+    </w:lvl>
+    <w:lvl w:ilvl="6" w:tentative="1">
+      <w:start w:val="1"/>
+      <w:numFmt w:val="bullet"/>
+      <w:lvlText w:val=""/>
+      <w:lvlJc w:val="left"/>
+      <w:pPr>
+        <w:tabs>
+          <w:tab w:val="num" w:pos="5040"/>
+        </w:tabs>
+        <w:ind w:left="5040" w:hanging="360"/>
+      </w:pPr>
+      <w:rPr>
+        <w:rFonts w:ascii="Wingdings" w:hAnsi="Wingdings" w:hint="default"/>
+        <w:sz w:val="20"/>
+      </w:rPr>
+    </w:lvl>
+    <w:lvl w:ilvl="7" w:tentative="1">
+      <w:start w:val="1"/>
+      <w:numFmt w:val="bullet"/>
+      <w:lvlText w:val=""/>
+      <w:lvlJc w:val="left"/>
+      <w:pPr>
+        <w:tabs>
+          <w:tab w:val="num" w:pos="5760"/>
+        </w:tabs>
+        <w:ind w:left="5760" w:hanging="360"/>
+      </w:pPr>
+      <w:rPr>
+        <w:rFonts w:ascii="Wingdings" w:hAnsi="Wingdings" w:hint="default"/>
+        <w:sz w:val="20"/>
+      </w:rPr>
+    </w:lvl>
+    <w:lvl w:ilvl="8" w:tentative="1">
+      <w:start w:val="1"/>
+      <w:numFmt w:val="bullet"/>
+      <w:lvlText w:val=""/>
+      <w:lvlJc w:val="left"/>
+      <w:pPr>
+        <w:tabs>
+          <w:tab w:val="num" w:pos="6480"/>
+        </w:tabs>
+        <w:ind w:left="6480" w:hanging="360"/>
+      </w:pPr>
+      <w:rPr>
+        <w:rFonts w:ascii="Wingdings" w:hAnsi="Wingdings" w:hint="default"/>
+        <w:sz w:val="20"/>
+      </w:rPr>
+    </w:lvl>
+  </w:abstractNum>
+  <w:abstractNum w:abstractNumId="6" w15:restartNumberingAfterBreak="0">
+    <w:nsid w:val="3E50357E"/>
+    <w:multiLevelType w:val="multilevel"/>
+    <w:tmpl w:val="E500ACFA"/>
+    <w:lvl w:ilvl="0">
+      <w:start w:val="1"/>
+      <w:numFmt w:val="bullet"/>
+      <w:lvlText w:val=""/>
+      <w:lvlJc w:val="left"/>
+      <w:pPr>
+        <w:tabs>
+          <w:tab w:val="num" w:pos="720"/>
+        </w:tabs>
+        <w:ind w:left="720" w:hanging="360"/>
+      </w:pPr>
+      <w:rPr>
+        <w:rFonts w:ascii="Symbol" w:hAnsi="Symbol" w:hint="default"/>
+        <w:sz w:val="20"/>
+      </w:rPr>
+    </w:lvl>
+    <w:lvl w:ilvl="1" w:tentative="1">
+      <w:start w:val="1"/>
+      <w:numFmt w:val="bullet"/>
+      <w:lvlText w:val="o"/>
+      <w:lvlJc w:val="left"/>
+      <w:pPr>
+        <w:tabs>
+          <w:tab w:val="num" w:pos="1440"/>
+        </w:tabs>
+        <w:ind w:left="1440" w:hanging="360"/>
+      </w:pPr>
+      <w:rPr>
+        <w:rFonts w:ascii="Courier New" w:hAnsi="Courier New" w:hint="default"/>
+        <w:sz w:val="20"/>
+      </w:rPr>
+    </w:lvl>
+    <w:lvl w:ilvl="2" w:tentative="1">
+      <w:start w:val="1"/>
+      <w:numFmt w:val="bullet"/>
+      <w:lvlText w:val=""/>
+      <w:lvlJc w:val="left"/>
+      <w:pPr>
+        <w:tabs>
+          <w:tab w:val="num" w:pos="2160"/>
+        </w:tabs>
+        <w:ind w:left="2160" w:hanging="360"/>
+      </w:pPr>
+      <w:rPr>
+        <w:rFonts w:ascii="Wingdings" w:hAnsi="Wingdings" w:hint="default"/>
+        <w:sz w:val="20"/>
+      </w:rPr>
+    </w:lvl>
+    <w:lvl w:ilvl="3" w:tentative="1">
+      <w:start w:val="1"/>
+      <w:numFmt w:val="bullet"/>
+      <w:lvlText w:val=""/>
+      <w:lvlJc w:val="left"/>
+      <w:pPr>
+        <w:tabs>
+          <w:tab w:val="num" w:pos="2880"/>
+        </w:tabs>
+        <w:ind w:left="2880" w:hanging="360"/>
+      </w:pPr>
+      <w:rPr>
+        <w:rFonts w:ascii="Wingdings" w:hAnsi="Wingdings" w:hint="default"/>
+        <w:sz w:val="20"/>
+      </w:rPr>
+    </w:lvl>
+    <w:lvl w:ilvl="4" w:tentative="1">
+      <w:start w:val="1"/>
+      <w:numFmt w:val="bullet"/>
+      <w:lvlText w:val=""/>
+      <w:lvlJc w:val="left"/>
+      <w:pPr>
+        <w:tabs>
+          <w:tab w:val="num" w:pos="3600"/>
+        </w:tabs>
+        <w:ind w:left="3600" w:hanging="360"/>
+      </w:pPr>
+      <w:rPr>
+        <w:rFonts w:ascii="Wingdings" w:hAnsi="Wingdings" w:hint="default"/>
+        <w:sz w:val="20"/>
+      </w:rPr>
+    </w:lvl>
+    <w:lvl w:ilvl="5" w:tentative="1">
+      <w:start w:val="1"/>
+      <w:numFmt w:val="bullet"/>
+      <w:lvlText w:val=""/>
+      <w:lvlJc w:val="left"/>
+      <w:pPr>
+        <w:tabs>
+          <w:tab w:val="num" w:pos="4320"/>
+        </w:tabs>
+        <w:ind w:left="4320" w:hanging="360"/>
+      </w:pPr>
+      <w:rPr>
+        <w:rFonts w:ascii="Wingdings" w:hAnsi="Wingdings" w:hint="default"/>
+        <w:sz w:val="20"/>
+      </w:rPr>
+    </w:lvl>
+    <w:lvl w:ilvl="6" w:tentative="1">
+      <w:start w:val="1"/>
+      <w:numFmt w:val="bullet"/>
+      <w:lvlText w:val=""/>
+      <w:lvlJc w:val="left"/>
+      <w:pPr>
+        <w:tabs>
+          <w:tab w:val="num" w:pos="5040"/>
+        </w:tabs>
+        <w:ind w:left="5040" w:hanging="360"/>
+      </w:pPr>
+      <w:rPr>
+        <w:rFonts w:ascii="Wingdings" w:hAnsi="Wingdings" w:hint="default"/>
+        <w:sz w:val="20"/>
+      </w:rPr>
+    </w:lvl>
+    <w:lvl w:ilvl="7" w:tentative="1">
+      <w:start w:val="1"/>
+      <w:numFmt w:val="bullet"/>
+      <w:lvlText w:val=""/>
+      <w:lvlJc w:val="left"/>
+      <w:pPr>
+        <w:tabs>
+          <w:tab w:val="num" w:pos="5760"/>
+        </w:tabs>
+        <w:ind w:left="5760" w:hanging="360"/>
+      </w:pPr>
+      <w:rPr>
+        <w:rFonts w:ascii="Wingdings" w:hAnsi="Wingdings" w:hint="default"/>
+        <w:sz w:val="20"/>
+      </w:rPr>
+    </w:lvl>
+    <w:lvl w:ilvl="8" w:tentative="1">
+      <w:start w:val="1"/>
+      <w:numFmt w:val="bullet"/>
+      <w:lvlText w:val=""/>
+      <w:lvlJc w:val="left"/>
+      <w:pPr>
+        <w:tabs>
+          <w:tab w:val="num" w:pos="6480"/>
+        </w:tabs>
+        <w:ind w:left="6480" w:hanging="360"/>
+      </w:pPr>
+      <w:rPr>
+        <w:rFonts w:ascii="Wingdings" w:hAnsi="Wingdings" w:hint="default"/>
+        <w:sz w:val="20"/>
+      </w:rPr>
+    </w:lvl>
+  </w:abstractNum>
+  <w:abstractNum w:abstractNumId="7" w15:restartNumberingAfterBreak="0">
+    <w:nsid w:val="5CBC5E2E"/>
+    <w:multiLevelType w:val="multilevel"/>
+    <w:tmpl w:val="C130CBAC"/>
+    <w:lvl w:ilvl="0">
+      <w:start w:val="1"/>
+      <w:numFmt w:val="bullet"/>
+      <w:lvlText w:val=""/>
+      <w:lvlJc w:val="left"/>
+      <w:pPr>
+        <w:tabs>
+          <w:tab w:val="num" w:pos="720"/>
+        </w:tabs>
+        <w:ind w:left="720" w:hanging="360"/>
+      </w:pPr>
+      <w:rPr>
+        <w:rFonts w:ascii="Symbol" w:hAnsi="Symbol" w:hint="default"/>
+        <w:sz w:val="20"/>
+      </w:rPr>
+    </w:lvl>
+    <w:lvl w:ilvl="1" w:tentative="1">
+      <w:start w:val="1"/>
+      <w:numFmt w:val="bullet"/>
+      <w:lvlText w:val="o"/>
+      <w:lvlJc w:val="left"/>
+      <w:pPr>
+        <w:tabs>
+          <w:tab w:val="num" w:pos="1440"/>
+        </w:tabs>
+        <w:ind w:left="1440" w:hanging="360"/>
+      </w:pPr>
+      <w:rPr>
+        <w:rFonts w:ascii="Courier New" w:hAnsi="Courier New" w:hint="default"/>
+        <w:sz w:val="20"/>
+      </w:rPr>
+    </w:lvl>
+    <w:lvl w:ilvl="2" w:tentative="1">
+      <w:start w:val="1"/>
+      <w:numFmt w:val="bullet"/>
+      <w:lvlText w:val=""/>
+      <w:lvlJc w:val="left"/>
+      <w:pPr>
+        <w:tabs>
+          <w:tab w:val="num" w:pos="2160"/>
+        </w:tabs>
+        <w:ind w:left="2160" w:hanging="360"/>
+      </w:pPr>
+      <w:rPr>
+        <w:rFonts w:ascii="Wingdings" w:hAnsi="Wingdings" w:hint="default"/>
+        <w:sz w:val="20"/>
+      </w:rPr>
+    </w:lvl>
+    <w:lvl w:ilvl="3" w:tentative="1">
+      <w:start w:val="1"/>
+      <w:numFmt w:val="bullet"/>
+      <w:lvlText w:val=""/>
+      <w:lvlJc w:val="left"/>
+      <w:pPr>
+        <w:tabs>
+          <w:tab w:val="num" w:pos="2880"/>
+        </w:tabs>
+        <w:ind w:left="2880" w:hanging="360"/>
+      </w:pPr>
+      <w:rPr>
+        <w:rFonts w:ascii="Wingdings" w:hAnsi="Wingdings" w:hint="default"/>
+        <w:sz w:val="20"/>
+      </w:rPr>
+    </w:lvl>
+    <w:lvl w:ilvl="4" w:tentative="1">
+      <w:start w:val="1"/>
+      <w:numFmt w:val="bullet"/>
+      <w:lvlText w:val=""/>
+      <w:lvlJc w:val="left"/>
+      <w:pPr>
+        <w:tabs>
+          <w:tab w:val="num" w:pos="3600"/>
+        </w:tabs>
+        <w:ind w:left="3600" w:hanging="360"/>
+      </w:pPr>
+      <w:rPr>
+        <w:rFonts w:ascii="Wingdings" w:hAnsi="Wingdings" w:hint="default"/>
+        <w:sz w:val="20"/>
+      </w:rPr>
+    </w:lvl>
+    <w:lvl w:ilvl="5" w:tentative="1">
+      <w:start w:val="1"/>
+      <w:numFmt w:val="bullet"/>
+      <w:lvlText w:val=""/>
+      <w:lvlJc w:val="left"/>
+      <w:pPr>
+        <w:tabs>
+          <w:tab w:val="num" w:pos="4320"/>
+        </w:tabs>
+        <w:ind w:left="4320" w:hanging="360"/>
+      </w:pPr>
+      <w:rPr>
+        <w:rFonts w:ascii="Wingdings" w:hAnsi="Wingdings" w:hint="default"/>
+        <w:sz w:val="20"/>
+      </w:rPr>
+    </w:lvl>
+    <w:lvl w:ilvl="6" w:tentative="1">
+      <w:start w:val="1"/>
+      <w:numFmt w:val="bullet"/>
+      <w:lvlText w:val=""/>
+      <w:lvlJc w:val="left"/>
+      <w:pPr>
+        <w:tabs>
+          <w:tab w:val="num" w:pos="5040"/>
+        </w:tabs>
+        <w:ind w:left="5040" w:hanging="360"/>
+      </w:pPr>
+      <w:rPr>
+        <w:rFonts w:ascii="Wingdings" w:hAnsi="Wingdings" w:hint="default"/>
+        <w:sz w:val="20"/>
+      </w:rPr>
+    </w:lvl>
+    <w:lvl w:ilvl="7" w:tentative="1">
+      <w:start w:val="1"/>
+      <w:numFmt w:val="bullet"/>
+      <w:lvlText w:val=""/>
+      <w:lvlJc w:val="left"/>
+      <w:pPr>
+        <w:tabs>
+          <w:tab w:val="num" w:pos="5760"/>
+        </w:tabs>
+        <w:ind w:left="5760" w:hanging="360"/>
+      </w:pPr>
+      <w:rPr>
+        <w:rFonts w:ascii="Wingdings" w:hAnsi="Wingdings" w:hint="default"/>
+        <w:sz w:val="20"/>
+      </w:rPr>
+    </w:lvl>
+    <w:lvl w:ilvl="8" w:tentative="1">
+      <w:start w:val="1"/>
+      <w:numFmt w:val="bullet"/>
+      <w:lvlText w:val=""/>
+      <w:lvlJc w:val="left"/>
+      <w:pPr>
+        <w:tabs>
+          <w:tab w:val="num" w:pos="6480"/>
+        </w:tabs>
+        <w:ind w:left="6480" w:hanging="360"/>
+      </w:pPr>
+      <w:rPr>
+        <w:rFonts w:ascii="Wingdings" w:hAnsi="Wingdings" w:hint="default"/>
+        <w:sz w:val="20"/>
+      </w:rPr>
+    </w:lvl>
+  </w:abstractNum>
+  <w:abstractNum w:abstractNumId="8" w15:restartNumberingAfterBreak="0">
+    <w:nsid w:val="64281AD6"/>
+    <w:multiLevelType w:val="multilevel"/>
+    <w:tmpl w:val="5A0CF31E"/>
+    <w:lvl w:ilvl="0">
+      <w:start w:val="1"/>
+      <w:numFmt w:val="bullet"/>
+      <w:lvlText w:val=""/>
+      <w:lvlJc w:val="left"/>
+      <w:pPr>
+        <w:tabs>
+          <w:tab w:val="num" w:pos="720"/>
+        </w:tabs>
+        <w:ind w:left="720" w:hanging="360"/>
+      </w:pPr>
+      <w:rPr>
+        <w:rFonts w:ascii="Symbol" w:hAnsi="Symbol" w:hint="default"/>
+        <w:sz w:val="20"/>
+      </w:rPr>
+    </w:lvl>
+    <w:lvl w:ilvl="1" w:tentative="1">
+      <w:start w:val="1"/>
+      <w:numFmt w:val="bullet"/>
+      <w:lvlText w:val="o"/>
+      <w:lvlJc w:val="left"/>
+      <w:pPr>
+        <w:tabs>
+          <w:tab w:val="num" w:pos="1440"/>
+        </w:tabs>
+        <w:ind w:left="1440" w:hanging="360"/>
+      </w:pPr>
+      <w:rPr>
+        <w:rFonts w:ascii="Courier New" w:hAnsi="Courier New" w:hint="default"/>
+        <w:sz w:val="20"/>
+      </w:rPr>
+    </w:lvl>
+    <w:lvl w:ilvl="2" w:tentative="1">
+      <w:start w:val="1"/>
+      <w:numFmt w:val="bullet"/>
+      <w:lvlText w:val=""/>
+      <w:lvlJc w:val="left"/>
+      <w:pPr>
+        <w:tabs>
+          <w:tab w:val="num" w:pos="2160"/>
+        </w:tabs>
+        <w:ind w:left="2160" w:hanging="360"/>
+      </w:pPr>
+      <w:rPr>
+        <w:rFonts w:ascii="Wingdings" w:hAnsi="Wingdings" w:hint="default"/>
+        <w:sz w:val="20"/>
+      </w:rPr>
+    </w:lvl>
+    <w:lvl w:ilvl="3" w:tentative="1">
+      <w:start w:val="1"/>
+      <w:numFmt w:val="bullet"/>
+      <w:lvlText w:val=""/>
+      <w:lvlJc w:val="left"/>
+      <w:pPr>
+        <w:tabs>
+          <w:tab w:val="num" w:pos="2880"/>
+        </w:tabs>
+        <w:ind w:left="2880" w:hanging="360"/>
+      </w:pPr>
+      <w:rPr>
+        <w:rFonts w:ascii="Wingdings" w:hAnsi="Wingdings" w:hint="default"/>
+        <w:sz w:val="20"/>
+      </w:rPr>
+    </w:lvl>
+    <w:lvl w:ilvl="4" w:tentative="1">
+      <w:start w:val="1"/>
+      <w:numFmt w:val="bullet"/>
+      <w:lvlText w:val=""/>
+      <w:lvlJc w:val="left"/>
+      <w:pPr>
+        <w:tabs>
+          <w:tab w:val="num" w:pos="3600"/>
+        </w:tabs>
+        <w:ind w:left="3600" w:hanging="360"/>
+      </w:pPr>
+      <w:rPr>
+        <w:rFonts w:ascii="Wingdings" w:hAnsi="Wingdings" w:hint="default"/>
+        <w:sz w:val="20"/>
+      </w:rPr>
+    </w:lvl>
+    <w:lvl w:ilvl="5" w:tentative="1">
+      <w:start w:val="1"/>
+      <w:numFmt w:val="bullet"/>
+      <w:lvlText w:val=""/>
+      <w:lvlJc w:val="left"/>
+      <w:pPr>
+        <w:tabs>
+          <w:tab w:val="num" w:pos="4320"/>
+        </w:tabs>
+        <w:ind w:left="4320" w:hanging="360"/>
+      </w:pPr>
+      <w:rPr>
+        <w:rFonts w:ascii="Wingdings" w:hAnsi="Wingdings" w:hint="default"/>
+        <w:sz w:val="20"/>
+      </w:rPr>
+    </w:lvl>
+    <w:lvl w:ilvl="6" w:tentative="1">
+      <w:start w:val="1"/>
+      <w:numFmt w:val="bullet"/>
+      <w:lvlText w:val=""/>
+      <w:lvlJc w:val="left"/>
+      <w:pPr>
+        <w:tabs>
+          <w:tab w:val="num" w:pos="5040"/>
+        </w:tabs>
+        <w:ind w:left="5040" w:hanging="360"/>
+      </w:pPr>
+      <w:rPr>
+        <w:rFonts w:ascii="Wingdings" w:hAnsi="Wingdings" w:hint="default"/>
+        <w:sz w:val="20"/>
+      </w:rPr>
+    </w:lvl>
+    <w:lvl w:ilvl="7" w:tentative="1">
+      <w:start w:val="1"/>
+      <w:numFmt w:val="bullet"/>
+      <w:lvlText w:val=""/>
+      <w:lvlJc w:val="left"/>
+      <w:pPr>
+        <w:tabs>
+          <w:tab w:val="num" w:pos="5760"/>
+        </w:tabs>
+        <w:ind w:left="5760" w:hanging="360"/>
+      </w:pPr>
+      <w:rPr>
+        <w:rFonts w:ascii="Wingdings" w:hAnsi="Wingdings" w:hint="default"/>
+        <w:sz w:val="20"/>
+      </w:rPr>
+    </w:lvl>
+    <w:lvl w:ilvl="8" w:tentative="1">
+      <w:start w:val="1"/>
+      <w:numFmt w:val="bullet"/>
+      <w:lvlText w:val=""/>
+      <w:lvlJc w:val="left"/>
+      <w:pPr>
+        <w:tabs>
+          <w:tab w:val="num" w:pos="6480"/>
+        </w:tabs>
+        <w:ind w:left="6480" w:hanging="360"/>
+      </w:pPr>
+      <w:rPr>
+        <w:rFonts w:ascii="Wingdings" w:hAnsi="Wingdings" w:hint="default"/>
+        <w:sz w:val="20"/>
+      </w:rPr>
+    </w:lvl>
+  </w:abstractNum>
+  <w:abstractNum w:abstractNumId="9" w15:restartNumberingAfterBreak="0">
+    <w:nsid w:val="73915314"/>
+    <w:multiLevelType w:val="multilevel"/>
+    <w:tmpl w:val="CCBE1D66"/>
+    <w:lvl w:ilvl="0">
+      <w:start w:val="1"/>
+      <w:numFmt w:val="bullet"/>
+      <w:lvlText w:val=""/>
+      <w:lvlJc w:val="left"/>
+      <w:pPr>
+        <w:tabs>
+          <w:tab w:val="num" w:pos="720"/>
+        </w:tabs>
+        <w:ind w:left="720" w:hanging="360"/>
+      </w:pPr>
+      <w:rPr>
+        <w:rFonts w:ascii="Symbol" w:hAnsi="Symbol" w:hint="default"/>
+        <w:sz w:val="20"/>
+      </w:rPr>
+    </w:lvl>
+    <w:lvl w:ilvl="1" w:tentative="1">
+      <w:start w:val="1"/>
+      <w:numFmt w:val="bullet"/>
+      <w:lvlText w:val="o"/>
+      <w:lvlJc w:val="left"/>
+      <w:pPr>
+        <w:tabs>
+          <w:tab w:val="num" w:pos="1440"/>
+        </w:tabs>
+        <w:ind w:left="1440" w:hanging="360"/>
+      </w:pPr>
+      <w:rPr>
+        <w:rFonts w:ascii="Courier New" w:hAnsi="Courier New" w:hint="default"/>
+        <w:sz w:val="20"/>
+      </w:rPr>
+    </w:lvl>
+    <w:lvl w:ilvl="2" w:tentative="1">
+      <w:start w:val="1"/>
+      <w:numFmt w:val="bullet"/>
+      <w:lvlText w:val=""/>
+      <w:lvlJc w:val="left"/>
+      <w:pPr>
+        <w:tabs>
+          <w:tab w:val="num" w:pos="2160"/>
+        </w:tabs>
+        <w:ind w:left="2160" w:hanging="360"/>
+      </w:pPr>
+      <w:rPr>
+        <w:rFonts w:ascii="Wingdings" w:hAnsi="Wingdings" w:hint="default"/>
+        <w:sz w:val="20"/>
+      </w:rPr>
+    </w:lvl>
+    <w:lvl w:ilvl="3" w:tentative="1">
+      <w:start w:val="1"/>
+      <w:numFmt w:val="bullet"/>
+      <w:lvlText w:val=""/>
+      <w:lvlJc w:val="left"/>
+      <w:pPr>
+        <w:tabs>
+          <w:tab w:val="num" w:pos="2880"/>
+        </w:tabs>
+        <w:ind w:left="2880" w:hanging="360"/>
+      </w:pPr>
+      <w:rPr>
+        <w:rFonts w:ascii="Wingdings" w:hAnsi="Wingdings" w:hint="default"/>
+        <w:sz w:val="20"/>
+      </w:rPr>
+    </w:lvl>
+    <w:lvl w:ilvl="4" w:tentative="1">
+      <w:start w:val="1"/>
+      <w:numFmt w:val="bullet"/>
+      <w:lvlText w:val=""/>
+      <w:lvlJc w:val="left"/>
+      <w:pPr>
+        <w:tabs>
+          <w:tab w:val="num" w:pos="3600"/>
+        </w:tabs>
+        <w:ind w:left="3600" w:hanging="360"/>
+      </w:pPr>
+      <w:rPr>
+        <w:rFonts w:ascii="Wingdings" w:hAnsi="Wingdings" w:hint="default"/>
+        <w:sz w:val="20"/>
+      </w:rPr>
+    </w:lvl>
+    <w:lvl w:ilvl="5" w:tentative="1">
+      <w:start w:val="1"/>
+      <w:numFmt w:val="bullet"/>
+      <w:lvlText w:val=""/>
+      <w:lvlJc w:val="left"/>
+      <w:pPr>
+        <w:tabs>
+          <w:tab w:val="num" w:pos="4320"/>
+        </w:tabs>
+        <w:ind w:left="4320" w:hanging="360"/>
+      </w:pPr>
+      <w:rPr>
+        <w:rFonts w:ascii="Wingdings" w:hAnsi="Wingdings" w:hint="default"/>
+        <w:sz w:val="20"/>
+      </w:rPr>
+    </w:lvl>
+    <w:lvl w:ilvl="6" w:tentative="1">
+      <w:start w:val="1"/>
+      <w:numFmt w:val="bullet"/>
+      <w:lvlText w:val=""/>
+      <w:lvlJc w:val="left"/>
+      <w:pPr>
+        <w:tabs>
+          <w:tab w:val="num" w:pos="5040"/>
+        </w:tabs>
+        <w:ind w:left="5040" w:hanging="360"/>
+      </w:pPr>
+      <w:rPr>
+        <w:rFonts w:ascii="Wingdings" w:hAnsi="Wingdings" w:hint="default"/>
+        <w:sz w:val="20"/>
+      </w:rPr>
+    </w:lvl>
+    <w:lvl w:ilvl="7" w:tentative="1">
+      <w:start w:val="1"/>
+      <w:numFmt w:val="bullet"/>
+      <w:lvlText w:val=""/>
+      <w:lvlJc w:val="left"/>
+      <w:pPr>
+        <w:tabs>
+          <w:tab w:val="num" w:pos="5760"/>
+        </w:tabs>
+        <w:ind w:left="5760" w:hanging="360"/>
+      </w:pPr>
+      <w:rPr>
+        <w:rFonts w:ascii="Wingdings" w:hAnsi="Wingdings" w:hint="default"/>
+        <w:sz w:val="20"/>
+      </w:rPr>
+    </w:lvl>
+    <w:lvl w:ilvl="8" w:tentative="1">
+      <w:start w:val="1"/>
+      <w:numFmt w:val="bullet"/>
+      <w:lvlText w:val=""/>
+      <w:lvlJc w:val="left"/>
+      <w:pPr>
+        <w:tabs>
+          <w:tab w:val="num" w:pos="6480"/>
+        </w:tabs>
+        <w:ind w:left="6480" w:hanging="360"/>
+      </w:pPr>
+      <w:rPr>
+        <w:rFonts w:ascii="Wingdings" w:hAnsi="Wingdings" w:hint="default"/>
+        <w:sz w:val="20"/>
+      </w:rPr>
+    </w:lvl>
+  </w:abstractNum>
+  <w:abstractNum w:abstractNumId="10" w15:restartNumberingAfterBreak="0">
+    <w:nsid w:val="7BA24843"/>
+    <w:multiLevelType w:val="multilevel"/>
+    <w:tmpl w:val="078CF460"/>
+    <w:lvl w:ilvl="0">
+      <w:start w:val="1"/>
+      <w:numFmt w:val="bullet"/>
+      <w:lvlText w:val=""/>
+      <w:lvlJc w:val="left"/>
+      <w:pPr>
+        <w:tabs>
+          <w:tab w:val="num" w:pos="720"/>
+        </w:tabs>
+        <w:ind w:left="720" w:hanging="360"/>
+      </w:pPr>
+      <w:rPr>
+        <w:rFonts w:ascii="Symbol" w:hAnsi="Symbol" w:hint="default"/>
+        <w:sz w:val="20"/>
+      </w:rPr>
+    </w:lvl>
+    <w:lvl w:ilvl="1" w:tentative="1">
+      <w:start w:val="1"/>
+      <w:numFmt w:val="bullet"/>
+      <w:lvlText w:val="o"/>
+      <w:lvlJc w:val="left"/>
+      <w:pPr>
+        <w:tabs>
+          <w:tab w:val="num" w:pos="1440"/>
+        </w:tabs>
+        <w:ind w:left="1440" w:hanging="360"/>
+      </w:pPr>
+      <w:rPr>
+        <w:rFonts w:ascii="Courier New" w:hAnsi="Courier New" w:hint="default"/>
+        <w:sz w:val="20"/>
+      </w:rPr>
+    </w:lvl>
+    <w:lvl w:ilvl="2" w:tentative="1">
+      <w:start w:val="1"/>
+      <w:numFmt w:val="bullet"/>
+      <w:lvlText w:val=""/>
+      <w:lvlJc w:val="left"/>
+      <w:pPr>
+        <w:tabs>
+          <w:tab w:val="num" w:pos="2160"/>
+        </w:tabs>
+        <w:ind w:left="2160" w:hanging="360"/>
+      </w:pPr>
+      <w:rPr>
+        <w:rFonts w:ascii="Wingdings" w:hAnsi="Wingdings" w:hint="default"/>
+        <w:sz w:val="20"/>
+      </w:rPr>
+    </w:lvl>
+    <w:lvl w:ilvl="3" w:tentative="1">
+      <w:start w:val="1"/>
+      <w:numFmt w:val="bullet"/>
+      <w:lvlText w:val=""/>
+      <w:lvlJc w:val="left"/>
+      <w:pPr>
+        <w:tabs>
+          <w:tab w:val="num" w:pos="2880"/>
+        </w:tabs>
+        <w:ind w:left="2880" w:hanging="360"/>
+      </w:pPr>
+      <w:rPr>
+        <w:rFonts w:ascii="Wingdings" w:hAnsi="Wingdings" w:hint="default"/>
+        <w:sz w:val="20"/>
+      </w:rPr>
+    </w:lvl>
+    <w:lvl w:ilvl="4" w:tentative="1">
+      <w:start w:val="1"/>
+      <w:numFmt w:val="bullet"/>
+      <w:lvlText w:val=""/>
+      <w:lvlJc w:val="left"/>
+      <w:pPr>
+        <w:tabs>
+          <w:tab w:val="num" w:pos="3600"/>
+        </w:tabs>
+        <w:ind w:left="3600" w:hanging="360"/>
+      </w:pPr>
+      <w:rPr>
+        <w:rFonts w:ascii="Wingdings" w:hAnsi="Wingdings" w:hint="default"/>
+        <w:sz w:val="20"/>
+      </w:rPr>
+    </w:lvl>
+    <w:lvl w:ilvl="5" w:tentative="1">
+      <w:start w:val="1"/>
+      <w:numFmt w:val="bullet"/>
+      <w:lvlText w:val=""/>
+      <w:lvlJc w:val="left"/>
+      <w:pPr>
+        <w:tabs>
+          <w:tab w:val="num" w:pos="4320"/>
+        </w:tabs>
+        <w:ind w:left="4320" w:hanging="360"/>
+      </w:pPr>
+      <w:rPr>
+        <w:rFonts w:ascii="Wingdings" w:hAnsi="Wingdings" w:hint="default"/>
+        <w:sz w:val="20"/>
+      </w:rPr>
+    </w:lvl>
+    <w:lvl w:ilvl="6" w:tentative="1">
+      <w:start w:val="1"/>
+      <w:numFmt w:val="bullet"/>
+      <w:lvlText w:val=""/>
+      <w:lvlJc w:val="left"/>
+      <w:pPr>
+        <w:tabs>
+          <w:tab w:val="num" w:pos="5040"/>
+        </w:tabs>
+        <w:ind w:left="5040" w:hanging="360"/>
+      </w:pPr>
+      <w:rPr>
+        <w:rFonts w:ascii="Wingdings" w:hAnsi="Wingdings" w:hint="default"/>
+        <w:sz w:val="20"/>
+      </w:rPr>
+    </w:lvl>
+    <w:lvl w:ilvl="7" w:tentative="1">
+      <w:start w:val="1"/>
+      <w:numFmt w:val="bullet"/>
+      <w:lvlText w:val=""/>
+      <w:lvlJc w:val="left"/>
+      <w:pPr>
+        <w:tabs>
+          <w:tab w:val="num" w:pos="5760"/>
+        </w:tabs>
+        <w:ind w:left="5760" w:hanging="360"/>
+      </w:pPr>
+      <w:rPr>
+        <w:rFonts w:ascii="Wingdings" w:hAnsi="Wingdings" w:hint="default"/>
+        <w:sz w:val="20"/>
+      </w:rPr>
+    </w:lvl>
+    <w:lvl w:ilvl="8" w:tentative="1">
+      <w:start w:val="1"/>
+      <w:numFmt w:val="bullet"/>
+      <w:lvlText w:val=""/>
+      <w:lvlJc w:val="left"/>
+      <w:pPr>
+        <w:tabs>
+          <w:tab w:val="num" w:pos="6480"/>
+        </w:tabs>
+        <w:ind w:left="6480" w:hanging="360"/>
+      </w:pPr>
+      <w:rPr>
+        <w:rFonts w:ascii="Wingdings" w:hAnsi="Wingdings" w:hint="default"/>
+        <w:sz w:val="20"/>
+      </w:rPr>
+    </w:lvl>
+  </w:abstractNum>
+  <w:num w:numId="1" w16cid:durableId="371226284">
+    <w:abstractNumId w:val="9"/>
+  </w:num>
+  <w:num w:numId="2" w16cid:durableId="949357082">
+    <w:abstractNumId w:val="8"/>
+  </w:num>
+  <w:num w:numId="3" w16cid:durableId="1224297232">
+    <w:abstractNumId w:val="6"/>
+  </w:num>
+  <w:num w:numId="4" w16cid:durableId="1500543213">
+    <w:abstractNumId w:val="10"/>
+  </w:num>
+  <w:num w:numId="5" w16cid:durableId="19623139">
+    <w:abstractNumId w:val="7"/>
+  </w:num>
+  <w:num w:numId="6" w16cid:durableId="1646161280">
+    <w:abstractNumId w:val="4"/>
+  </w:num>
+  <w:num w:numId="7" w16cid:durableId="345908533">
+    <w:abstractNumId w:val="0"/>
+  </w:num>
+  <w:num w:numId="8" w16cid:durableId="1166945119">
+    <w:abstractNumId w:val="2"/>
+  </w:num>
+  <w:num w:numId="9" w16cid:durableId="1855528972">
+    <w:abstractNumId w:val="5"/>
+  </w:num>
+  <w:num w:numId="10" w16cid:durableId="2024822152">
+    <w:abstractNumId w:val="3"/>
+  </w:num>
+  <w:num w:numId="11" w16cid:durableId="1665468345">
+    <w:abstractNumId w:val="1"/>
+  </w:num>
+</w:numbering>
+</file>
+
 <file path=word/styles.xml><?xml version="1.0" encoding="utf-8"?>
-<w:styles xmlns:mc="http://schemas.openxmlformats.org/markup-compatibility/2006" xmlns:r="http://schemas.openxmlformats.org/officeDocument/2006/relationships" xmlns:w="http://schemas.openxmlformats.org/wordprocessingml/2006/main" xmlns:w14="http://schemas.microsoft.com/office/word/2010/wordml" xmlns:w15="http://schemas.microsoft.com/office/word/2012/wordml" xmlns:w16cid="http://schemas.microsoft.com/office/word/2016/wordml/cid" xmlns:w16se="http://schemas.microsoft.com/office/word/2015/wordml/symex" mc:Ignorable="w14 w15 w16se w16cid">
+<w:styles xmlns:mc="http://schemas.openxmlformats.org/markup-compatibility/2006" xmlns:r="http://schemas.openxmlformats.org/officeDocument/2006/relationships" xmlns:w="http://schemas.openxmlformats.org/wordprocessingml/2006/main" xmlns:w14="http://schemas.microsoft.com/office/word/2010/wordml" xmlns:w15="http://schemas.microsoft.com/office/word/2012/wordml" xmlns:w16cex="http://schemas.microsoft.com/office/word/2018/wordml/cex" xmlns:w16cid="http://schemas.microsoft.com/office/word/2016/wordml/cid" xmlns:w16="http://schemas.microsoft.com/office/word/2018/wordml" xmlns:w16du="http://schemas.microsoft.com/office/word/2023/wordml/word16du" xmlns:w16sdtdh="http://schemas.microsoft.com/office/word/2020/wordml/sdtdatahash" xmlns:w16sdtfl="http://schemas.microsoft.com/office/word/2024/wordml/sdtformatlock" xmlns:w16se="http://schemas.microsoft.com/office/word/2015/wordml/symex" mc:Ignorable="w14 w15 w16se w16cid w16 w16cex w16sdtdh w16sdtfl w16du">
   <w:docDefaults>
     <w:rPrDefault>
       <w:rPr>
@@ -2199,7 +5198,7 @@
       </w:pPr>
     </w:pPrDefault>
   </w:docDefaults>
-  <w:latentStyles w:defLockedState="0" w:defUIPriority="99" w:defSemiHidden="0" w:defUnhideWhenUsed="0" w:defQFormat="0" w:count="375">
+  <w:latentStyles w:defLockedState="0" w:defUIPriority="99" w:defSemiHidden="0" w:defUnhideWhenUsed="0" w:defQFormat="0" w:count="376">
     <w:lsdException w:name="Normal" w:uiPriority="0" w:qFormat="1"/>
     <w:lsdException w:name="heading 1" w:uiPriority="9" w:qFormat="1"/>
     <w:lsdException w:name="heading 2" w:semiHidden="1" w:uiPriority="9" w:unhideWhenUsed="1" w:qFormat="1"/>
@@ -2575,6 +5574,7 @@
     <w:lsdException w:name="Smart Hyperlink" w:semiHidden="1" w:unhideWhenUsed="1"/>
     <w:lsdException w:name="Hashtag" w:semiHidden="1" w:unhideWhenUsed="1"/>
     <w:lsdException w:name="Unresolved Mention" w:semiHidden="1" w:unhideWhenUsed="1"/>
+    <w:lsdException w:name="Smart Link" w:semiHidden="1" w:unhideWhenUsed="1"/>
   </w:latentStyles>
   <w:style w:type="paragraph" w:default="1" w:styleId="Normal">
     <w:name w:val="Normal"/>
@@ -2705,7 +5705,6 @@
   <w:style w:type="character" w:default="1" w:styleId="DefaultParagraphFont">
     <w:name w:val="Default Paragraph Font"/>
     <w:uiPriority w:val="1"/>
-    <w:semiHidden/>
     <w:unhideWhenUsed/>
   </w:style>
   <w:style w:type="table" w:default="1" w:styleId="TableNormal">
@@ -2807,6 +5806,29 @@
     <w:link w:val="Footer"/>
     <w:uiPriority w:val="99"/>
     <w:rsid w:val="00280292"/>
+  </w:style>
+  <w:style w:type="character" w:styleId="Hyperlink">
+    <w:name w:val="Hyperlink"/>
+    <w:basedOn w:val="DefaultParagraphFont"/>
+    <w:uiPriority w:val="99"/>
+    <w:unhideWhenUsed/>
+    <w:rsid w:val="0076646A"/>
+    <w:rPr>
+      <w:color w:val="0563C1" w:themeColor="hyperlink"/>
+      <w:u w:val="single"/>
+    </w:rPr>
+  </w:style>
+  <w:style w:type="character" w:styleId="UnresolvedMention">
+    <w:name w:val="Unresolved Mention"/>
+    <w:basedOn w:val="DefaultParagraphFont"/>
+    <w:uiPriority w:val="99"/>
+    <w:semiHidden/>
+    <w:unhideWhenUsed/>
+    <w:rsid w:val="0076646A"/>
+    <w:rPr>
+      <w:color w:val="605E5C"/>
+      <w:shd w:val="clear" w:color="auto" w:fill="E1DFDD"/>
+    </w:rPr>
   </w:style>
 </w:styles>
 </file>

</xml_diff>